<commit_message>
Commit 4: Writing Capstone Scope Section
Today, 19/10/2026, I wrote about the final scope regarding what will be included in the first and second semesters.
</commit_message>
<xml_diff>
--- a/SA25074_CA1_ Strategic_Thinking_v1.docx
+++ b/SA25074_CA1_ Strategic_Thinking_v1.docx
@@ -847,23 +847,7 @@
                                 <w:color w:val="000000"/>
                                 <w:sz w:val="28"/>
                               </w:rPr>
-                              <w:t xml:space="preserve">By submitting this assessment, I confirm that I have read the CCT policy on academic misconduct and understand the implications of submitting work that is not my own or does not appropriately reference material </w:t>
-                            </w:r>
-                            <w:proofErr w:type="gramStart"/>
-                            <w:r>
-                              <w:rPr>
-                                <w:color w:val="000000"/>
-                                <w:sz w:val="28"/>
-                              </w:rPr>
-                              <w:t>taken</w:t>
-                            </w:r>
-                            <w:proofErr w:type="gramEnd"/>
-                            <w:r>
-                              <w:rPr>
-                                <w:color w:val="000000"/>
-                                <w:sz w:val="28"/>
-                              </w:rPr>
-                              <w:t xml:space="preserve"> from a third party or other source. </w:t>
+                              <w:t xml:space="preserve">By submitting this assessment, I confirm that I have read the CCT policy on academic misconduct and understand the implications of submitting work that is not my own or does not appropriately reference material taken from a third party or other source. </w:t>
                             </w:r>
                           </w:p>
                           <w:p>
@@ -933,23 +917,7 @@
                           <w:color w:val="000000"/>
                           <w:sz w:val="28"/>
                         </w:rPr>
-                        <w:t xml:space="preserve">By submitting this assessment, I confirm that I have read the CCT policy on academic misconduct and understand the implications of submitting work that is not my own or does not appropriately reference material </w:t>
-                      </w:r>
-                      <w:proofErr w:type="gramStart"/>
-                      <w:r>
-                        <w:rPr>
-                          <w:color w:val="000000"/>
-                          <w:sz w:val="28"/>
-                        </w:rPr>
-                        <w:t>taken</w:t>
-                      </w:r>
-                      <w:proofErr w:type="gramEnd"/>
-                      <w:r>
-                        <w:rPr>
-                          <w:color w:val="000000"/>
-                          <w:sz w:val="28"/>
-                        </w:rPr>
-                        <w:t xml:space="preserve"> from a third party or other source. </w:t>
+                        <w:t xml:space="preserve">By submitting this assessment, I confirm that I have read the CCT policy on academic misconduct and understand the implications of submitting work that is not my own or does not appropriately reference material taken from a third party or other source. </w:t>
                       </w:r>
                     </w:p>
                     <w:p>
@@ -1522,7 +1490,13 @@
           <w:rFonts w:eastAsia="Aptos"/>
         </w:rPr>
         <w:lastRenderedPageBreak/>
-        <w:t>Spotify – Music Recommendation System</w:t>
+        <w:t>MyMusic - Music</w:t>
+      </w:r>
+      <w:r>
+        <w:rPr>
+          <w:rFonts w:eastAsia="Aptos"/>
+        </w:rPr>
+        <w:t xml:space="preserve"> Recommendation System</w:t>
       </w:r>
       <w:bookmarkEnd w:id="0"/>
     </w:p>
@@ -1570,7 +1544,16 @@
           <w:sz w:val="24"/>
           <w:szCs w:val="24"/>
         </w:rPr>
-        <w:t>Spotify is a new company which</w:t>
+        <w:t xml:space="preserve">MyMusic </w:t>
+      </w:r>
+      <w:r>
+        <w:rPr>
+          <w:rFonts w:ascii="Aptos" w:eastAsia="Aptos" w:hAnsi="Aptos" w:cs="Aptos"/>
+          <w:bCs/>
+          <w:sz w:val="24"/>
+          <w:szCs w:val="24"/>
+        </w:rPr>
+        <w:t>is a new company which</w:t>
       </w:r>
       <w:r>
         <w:rPr>
@@ -1826,11 +1809,9 @@
       <w:r>
         <w:t xml:space="preserve"> Before starting working with our </w:t>
       </w:r>
-      <w:proofErr w:type="gramStart"/>
-      <w:r>
-        <w:t>data</w:t>
-      </w:r>
-      <w:proofErr w:type="gramEnd"/>
+      <w:r>
+        <w:t>data,</w:t>
+      </w:r>
       <w:r>
         <w:t xml:space="preserve"> we should identify what outcome we want to obtain </w:t>
       </w:r>
@@ -1911,6 +1892,45 @@
           <w:bCs/>
         </w:rPr>
       </w:pPr>
+    </w:p>
+    <w:p>
+      <w:pPr>
+        <w:pStyle w:val="Heading2"/>
+        <w:rPr>
+          <w:rFonts w:eastAsia="Aptos"/>
+        </w:rPr>
+      </w:pPr>
+      <w:r>
+        <w:rPr>
+          <w:rFonts w:eastAsia="Aptos"/>
+        </w:rPr>
+        <w:t>Scope</w:t>
+      </w:r>
+    </w:p>
+    <w:p>
+      <w:r>
+        <w:t xml:space="preserve">In the first semester, </w:t>
+      </w:r>
+      <w:r>
+        <w:t>I</w:t>
+      </w:r>
+      <w:r>
+        <w:t xml:space="preserve"> will include all the work in relation to data research, investigation, and exploration of different Spotify datasets on different platforms. We will also dig into understanding our dataset, looking up for patterns, correlations, and relationships between the different features, and deciding what machine learning model will be the best for our desired outcome</w:t>
+      </w:r>
+    </w:p>
+    <w:p>
+      <w:r>
+        <w:t xml:space="preserve">In the second semester, </w:t>
+      </w:r>
+      <w:r>
+        <w:t>I</w:t>
+      </w:r>
+      <w:r>
+        <w:t xml:space="preserve"> will start working on our machine learning model </w:t>
+      </w:r>
+      <w:r>
+        <w:t>by training it, checking and comparing predicted results (Accuracy, F1, Recall, Precision, etc.), and making any relevant changes to its parameters to improve it. Once we finish with this, we will do a final test and send it to production.</w:t>
+      </w:r>
     </w:p>
     <w:p>
       <w:pPr>
@@ -5221,6 +5241,10 @@
 </file>
 
 <file path=customXml/item1.xml><?xml version="1.0" encoding="utf-8"?>
+<b:Sources xmlns:b="http://schemas.openxmlformats.org/officeDocument/2006/bibliography" xmlns="http://schemas.openxmlformats.org/officeDocument/2006/bibliography" SelectedStyle="\APASixthEditionOfficeOnline.xsl" StyleName="APA" Version="6"/>
+</file>
+
+<file path=customXml/item2.xml><?xml version="1.0" encoding="utf-8"?>
 <?mso-contentType ?>
 <FormTemplates xmlns="http://schemas.microsoft.com/sharepoint/v3/contenttype/forms">
   <Display>DocumentLibraryForm</Display>
@@ -5229,11 +5253,21 @@
 </FormTemplates>
 </file>
 
-<file path=customXml/item2.xml><?xml version="1.0" encoding="utf-8"?>
-<b:Sources xmlns:b="http://schemas.openxmlformats.org/officeDocument/2006/bibliography" xmlns="http://schemas.openxmlformats.org/officeDocument/2006/bibliography" SelectedStyle="\APASixthEditionOfficeOnline.xsl" StyleName="APA" Version="6"/>
+<file path=customXml/item3.xml><?xml version="1.0" encoding="utf-8"?>
+<p:properties xmlns:p="http://schemas.microsoft.com/office/2006/metadata/properties" xmlns:xsi="http://www.w3.org/2001/XMLSchema-instance" xmlns:pc="http://schemas.microsoft.com/office/infopath/2007/PartnerControls">
+  <documentManagement>
+    <_activity xmlns="b16a9495-4dfd-42d3-807b-98cb11f03b43" xsi:nil="true"/>
+  </documentManagement>
+</p:properties>
 </file>
 
-<file path=customXml/item3.xml><?xml version="1.0" encoding="utf-8"?>
+<file path=customXml/item4.xml><?xml version="1.0" encoding="utf-8"?>
+<go:gDocsCustomXmlDataStorage xmlns:go="http://customooxmlschemas.google.com/" xmlns:r="http://schemas.openxmlformats.org/officeDocument/2006/relationships" uri="GoogleDocsCustomDataVersion2">
+  <go:docsCustomData xmlns:go="http://customooxmlschemas.google.com/" roundtripDataSignature="AMtx7miehlgh2pzFvkmpnhkVaeODs3Wnuw==">CgMxLjAyCGguZ2pkZ3hzMgloLjMwajB6bGwyCWguMWZvYjl0ZTIJaC4zem55c2g3MgloLjJldDkycDAyDmgua2ZranMzcndsMmMxOAByITF6bEVRVXYyWkdtTjZWemdfYk5uaGpmb0x1c2hhYUo3dw==</go:docsCustomData>
+</go:gDocsCustomXmlDataStorage>
+</file>
+
+<file path=customXml/item5.xml><?xml version="1.0" encoding="utf-8"?>
 <ct:contentTypeSchema xmlns:ct="http://schemas.microsoft.com/office/2006/metadata/contentType" xmlns:ma="http://schemas.microsoft.com/office/2006/metadata/properties/metaAttributes" ct:_="" ma:_="" ma:contentTypeName="Document" ma:contentTypeID="0x01010091CA7052A48FB44E8BAE44044031FC77" ma:contentTypeVersion="5" ma:contentTypeDescription="Create a new document." ma:contentTypeScope="" ma:versionID="72110da391d7bf7bbbd9879cda66318c">
   <xsd:schema xmlns:xsd="http://www.w3.org/2001/XMLSchema" xmlns:xs="http://www.w3.org/2001/XMLSchema" xmlns:p="http://schemas.microsoft.com/office/2006/metadata/properties" xmlns:ns3="b16a9495-4dfd-42d3-807b-98cb11f03b43" targetNamespace="http://schemas.microsoft.com/office/2006/metadata/properties" ma:root="true" ma:fieldsID="65d4c4ab10123b5e2192ffab3149626d" ns3:_="">
     <xsd:import namespace="b16a9495-4dfd-42d3-807b-98cb11f03b43"/>
@@ -5383,21 +5417,15 @@
 </ct:contentTypeSchema>
 </file>
 
-<file path=customXml/item4.xml><?xml version="1.0" encoding="utf-8"?>
-<go:gDocsCustomXmlDataStorage xmlns:go="http://customooxmlschemas.google.com/" xmlns:r="http://schemas.openxmlformats.org/officeDocument/2006/relationships" uri="GoogleDocsCustomDataVersion2">
-  <go:docsCustomData xmlns:go="http://customooxmlschemas.google.com/" roundtripDataSignature="AMtx7miehlgh2pzFvkmpnhkVaeODs3Wnuw==">CgMxLjAyCGguZ2pkZ3hzMgloLjMwajB6bGwyCWguMWZvYjl0ZTIJaC4zem55c2g3MgloLjJldDkycDAyDmgua2ZranMzcndsMmMxOAByITF6bEVRVXYyWkdtTjZWemdfYk5uaGpmb0x1c2hhYUo3dw==</go:docsCustomData>
-</go:gDocsCustomXmlDataStorage>
+<file path=customXml/itemProps1.xml><?xml version="1.0" encoding="utf-8"?>
+<ds:datastoreItem xmlns:ds="http://schemas.openxmlformats.org/officeDocument/2006/customXml" ds:itemID="{A5C61161-19E4-4D42-A5DA-EC591AFE0A7D}">
+  <ds:schemaRefs>
+    <ds:schemaRef ds:uri="http://schemas.openxmlformats.org/officeDocument/2006/bibliography"/>
+  </ds:schemaRefs>
+</ds:datastoreItem>
 </file>
 
-<file path=customXml/item5.xml><?xml version="1.0" encoding="utf-8"?>
-<p:properties xmlns:p="http://schemas.microsoft.com/office/2006/metadata/properties" xmlns:xsi="http://www.w3.org/2001/XMLSchema-instance" xmlns:pc="http://schemas.microsoft.com/office/infopath/2007/PartnerControls">
-  <documentManagement>
-    <_activity xmlns="b16a9495-4dfd-42d3-807b-98cb11f03b43" xsi:nil="true"/>
-  </documentManagement>
-</p:properties>
-</file>
-
-<file path=customXml/itemProps1.xml><?xml version="1.0" encoding="utf-8"?>
+<file path=customXml/itemProps2.xml><?xml version="1.0" encoding="utf-8"?>
 <ds:datastoreItem xmlns:ds="http://schemas.openxmlformats.org/officeDocument/2006/customXml" ds:itemID="{AD64260C-1345-4C21-A804-B9FBE7B91489}">
   <ds:schemaRefs>
     <ds:schemaRef ds:uri="http://schemas.microsoft.com/sharepoint/v3/contenttype/forms"/>
@@ -5405,15 +5433,26 @@
 </ds:datastoreItem>
 </file>
 
-<file path=customXml/itemProps2.xml><?xml version="1.0" encoding="utf-8"?>
-<ds:datastoreItem xmlns:ds="http://schemas.openxmlformats.org/officeDocument/2006/customXml" ds:itemID="{A5C61161-19E4-4D42-A5DA-EC591AFE0A7D}">
+<file path=customXml/itemProps3.xml><?xml version="1.0" encoding="utf-8"?>
+<ds:datastoreItem xmlns:ds="http://schemas.openxmlformats.org/officeDocument/2006/customXml" ds:itemID="{D51EB97A-8C7A-4EE1-A3AD-E57FDBFA6BEE}">
   <ds:schemaRefs>
-    <ds:schemaRef ds:uri="http://schemas.openxmlformats.org/officeDocument/2006/bibliography"/>
+    <ds:schemaRef ds:uri="http://schemas.microsoft.com/office/2006/metadata/properties"/>
+    <ds:schemaRef ds:uri="http://schemas.microsoft.com/office/infopath/2007/PartnerControls"/>
+    <ds:schemaRef ds:uri="b16a9495-4dfd-42d3-807b-98cb11f03b43"/>
   </ds:schemaRefs>
 </ds:datastoreItem>
 </file>
 
-<file path=customXml/itemProps3.xml><?xml version="1.0" encoding="utf-8"?>
+<file path=customXml/itemProps4.xml><?xml version="1.0" encoding="utf-8"?>
+<ds:datastoreItem xmlns:ds="http://schemas.openxmlformats.org/officeDocument/2006/customXml" ds:itemID="{11111111-1234-1234-1234-123412341234}">
+  <ds:schemaRefs>
+    <ds:schemaRef ds:uri="http://customooxmlschemas.google.com/"/>
+    <ds:schemaRef ds:uri="http://schemas.openxmlformats.org/officeDocument/2006/relationships"/>
+  </ds:schemaRefs>
+</ds:datastoreItem>
+</file>
+
+<file path=customXml/itemProps5.xml><?xml version="1.0" encoding="utf-8"?>
 <ds:datastoreItem xmlns:ds="http://schemas.openxmlformats.org/officeDocument/2006/customXml" ds:itemID="{1CD39011-2B34-4226-8638-59B13D86301D}">
   <ds:schemaRefs>
     <ds:schemaRef ds:uri="http://schemas.microsoft.com/office/2006/metadata/contentType"/>
@@ -5429,23 +5468,4 @@
     <ds:schemaRef ds:uri="http://schemas.microsoft.com/internal/obd"/>
   </ds:schemaRefs>
 </ds:datastoreItem>
-</file>
-
-<file path=customXml/itemProps4.xml><?xml version="1.0" encoding="utf-8"?>
-<ds:datastoreItem xmlns:ds="http://schemas.openxmlformats.org/officeDocument/2006/customXml" ds:itemID="{11111111-1234-1234-1234-123412341234}">
-  <ds:schemaRefs>
-    <ds:schemaRef ds:uri="http://customooxmlschemas.google.com/"/>
-    <ds:schemaRef ds:uri="http://schemas.openxmlformats.org/officeDocument/2006/relationships"/>
-  </ds:schemaRefs>
-</ds:datastoreItem>
-</file>
-
-<file path=customXml/itemProps5.xml><?xml version="1.0" encoding="utf-8"?>
-<ds:datastoreItem xmlns:ds="http://schemas.openxmlformats.org/officeDocument/2006/customXml" ds:itemID="{D51EB97A-8C7A-4EE1-A3AD-E57FDBFA6BEE}">
-  <ds:schemaRefs>
-    <ds:schemaRef ds:uri="http://schemas.microsoft.com/office/2006/metadata/properties"/>
-    <ds:schemaRef ds:uri="http://schemas.microsoft.com/office/infopath/2007/PartnerControls"/>
-    <ds:schemaRef ds:uri="b16a9495-4dfd-42d3-807b-98cb11f03b43"/>
-  </ds:schemaRefs>
-</ds:datastoreItem>
 </file>
</xml_diff>

<commit_message>
Commit 6: Data Sources
For this section, I found 2 interesting datasets that can help us in the development of our model
</commit_message>
<xml_diff>
--- a/SA25074_CA1_ Strategic_Thinking_v1.docx
+++ b/SA25074_CA1_ Strategic_Thinking_v1.docx
@@ -854,7 +854,23 @@
                                 <w:color w:val="000000"/>
                                 <w:sz w:val="28"/>
                               </w:rPr>
-                              <w:t xml:space="preserve">By submitting this assessment, I confirm that I have read the CCT policy on academic misconduct and understand the implications of submitting work that is not my own or does not appropriately reference material taken from a third party or other source. </w:t>
+                              <w:t xml:space="preserve">By submitting this assessment, I confirm that I have read the CCT policy on academic misconduct and understand the implications of submitting work that is not my own or does not appropriately reference material </w:t>
+                            </w:r>
+                            <w:proofErr w:type="gramStart"/>
+                            <w:r>
+                              <w:rPr>
+                                <w:color w:val="000000"/>
+                                <w:sz w:val="28"/>
+                              </w:rPr>
+                              <w:t>taken</w:t>
+                            </w:r>
+                            <w:proofErr w:type="gramEnd"/>
+                            <w:r>
+                              <w:rPr>
+                                <w:color w:val="000000"/>
+                                <w:sz w:val="28"/>
+                              </w:rPr>
+                              <w:t xml:space="preserve"> from a third party or other source. </w:t>
                             </w:r>
                           </w:p>
                           <w:p>
@@ -867,7 +883,23 @@
                                 <w:color w:val="000000"/>
                                 <w:sz w:val="28"/>
                               </w:rPr>
-                              <w:t>I declare it to be my own work and that all material from third parties has been appropriately referenced.</w:t>
+                              <w:t xml:space="preserve">I declare it to be my own work and that all material from third parties has </w:t>
+                            </w:r>
+                            <w:proofErr w:type="gramStart"/>
+                            <w:r>
+                              <w:rPr>
+                                <w:color w:val="000000"/>
+                                <w:sz w:val="28"/>
+                              </w:rPr>
+                              <w:t>been appropriately referenced</w:t>
+                            </w:r>
+                            <w:proofErr w:type="gramEnd"/>
+                            <w:r>
+                              <w:rPr>
+                                <w:color w:val="000000"/>
+                                <w:sz w:val="28"/>
+                              </w:rPr>
+                              <w:t>.</w:t>
                             </w:r>
                           </w:p>
                           <w:p>
@@ -880,7 +912,23 @@
                                 <w:color w:val="000000"/>
                                 <w:sz w:val="28"/>
                               </w:rPr>
-                              <w:t xml:space="preserve"> I further confirm that this work has not previously been submitted for assessment by myself or someone else in CCT College Dublin or any other higher education institution.</w:t>
+                              <w:t xml:space="preserve"> I further confirm that this work has not previously </w:t>
+                            </w:r>
+                            <w:proofErr w:type="gramStart"/>
+                            <w:r>
+                              <w:rPr>
+                                <w:color w:val="000000"/>
+                                <w:sz w:val="28"/>
+                              </w:rPr>
+                              <w:t>been submitted</w:t>
+                            </w:r>
+                            <w:proofErr w:type="gramEnd"/>
+                            <w:r>
+                              <w:rPr>
+                                <w:color w:val="000000"/>
+                                <w:sz w:val="28"/>
+                              </w:rPr>
+                              <w:t xml:space="preserve"> for assessment by myself or someone else in CCT College Dublin or any other higher education institution.</w:t>
                             </w:r>
                           </w:p>
                         </w:txbxContent>
@@ -924,7 +972,23 @@
                           <w:color w:val="000000"/>
                           <w:sz w:val="28"/>
                         </w:rPr>
-                        <w:t xml:space="preserve">By submitting this assessment, I confirm that I have read the CCT policy on academic misconduct and understand the implications of submitting work that is not my own or does not appropriately reference material taken from a third party or other source. </w:t>
+                        <w:t xml:space="preserve">By submitting this assessment, I confirm that I have read the CCT policy on academic misconduct and understand the implications of submitting work that is not my own or does not appropriately reference material </w:t>
+                      </w:r>
+                      <w:proofErr w:type="gramStart"/>
+                      <w:r>
+                        <w:rPr>
+                          <w:color w:val="000000"/>
+                          <w:sz w:val="28"/>
+                        </w:rPr>
+                        <w:t>taken</w:t>
+                      </w:r>
+                      <w:proofErr w:type="gramEnd"/>
+                      <w:r>
+                        <w:rPr>
+                          <w:color w:val="000000"/>
+                          <w:sz w:val="28"/>
+                        </w:rPr>
+                        <w:t xml:space="preserve"> from a third party or other source. </w:t>
                       </w:r>
                     </w:p>
                     <w:p>
@@ -937,7 +1001,23 @@
                           <w:color w:val="000000"/>
                           <w:sz w:val="28"/>
                         </w:rPr>
-                        <w:t>I declare it to be my own work and that all material from third parties has been appropriately referenced.</w:t>
+                        <w:t xml:space="preserve">I declare it to be my own work and that all material from third parties has </w:t>
+                      </w:r>
+                      <w:proofErr w:type="gramStart"/>
+                      <w:r>
+                        <w:rPr>
+                          <w:color w:val="000000"/>
+                          <w:sz w:val="28"/>
+                        </w:rPr>
+                        <w:t>been appropriately referenced</w:t>
+                      </w:r>
+                      <w:proofErr w:type="gramEnd"/>
+                      <w:r>
+                        <w:rPr>
+                          <w:color w:val="000000"/>
+                          <w:sz w:val="28"/>
+                        </w:rPr>
+                        <w:t>.</w:t>
                       </w:r>
                     </w:p>
                     <w:p>
@@ -950,7 +1030,23 @@
                           <w:color w:val="000000"/>
                           <w:sz w:val="28"/>
                         </w:rPr>
-                        <w:t xml:space="preserve"> I further confirm that this work has not previously been submitted for assessment by myself or someone else in CCT College Dublin or any other higher education institution.</w:t>
+                        <w:t xml:space="preserve"> I further confirm that this work has not previously </w:t>
+                      </w:r>
+                      <w:proofErr w:type="gramStart"/>
+                      <w:r>
+                        <w:rPr>
+                          <w:color w:val="000000"/>
+                          <w:sz w:val="28"/>
+                        </w:rPr>
+                        <w:t>been submitted</w:t>
+                      </w:r>
+                      <w:proofErr w:type="gramEnd"/>
+                      <w:r>
+                        <w:rPr>
+                          <w:color w:val="000000"/>
+                          <w:sz w:val="28"/>
+                        </w:rPr>
+                        <w:t xml:space="preserve"> for assessment by myself or someone else in CCT College Dublin or any other higher education institution.</w:t>
                       </w:r>
                     </w:p>
                   </w:txbxContent>
@@ -1039,7 +1135,7 @@
           <w:r>
             <w:fldChar w:fldCharType="separate"/>
           </w:r>
-          <w:hyperlink w:anchor="_Toc243401836" w:history="1">
+          <w:hyperlink w:anchor="_Toc243404435" w:history="1">
             <w:r>
               <w:rPr>
                 <w:rStyle w:val="Hyperlink"/>
@@ -1067,7 +1163,7 @@
                 <w:noProof/>
                 <w:webHidden/>
               </w:rPr>
-              <w:instrText xml:space="preserve"> PAGEREF _Toc243401836 \h </w:instrText>
+              <w:instrText xml:space="preserve"> PAGEREF _Toc243404435 \h </w:instrText>
             </w:r>
             <w:r>
               <w:rPr>
@@ -1113,7 +1209,7 @@
               <w14:ligatures w14:val="standardContextual"/>
             </w:rPr>
           </w:pPr>
-          <w:hyperlink w:anchor="_Toc243401837" w:history="1">
+          <w:hyperlink w:anchor="_Toc243404436" w:history="1">
             <w:r>
               <w:rPr>
                 <w:rStyle w:val="Hyperlink"/>
@@ -1141,7 +1237,7 @@
                 <w:noProof/>
                 <w:webHidden/>
               </w:rPr>
-              <w:instrText xml:space="preserve"> PAGEREF _Toc243401837 \h </w:instrText>
+              <w:instrText xml:space="preserve"> PAGEREF _Toc243404436 \h </w:instrText>
             </w:r>
             <w:r>
               <w:rPr>
@@ -1187,7 +1283,7 @@
               <w14:ligatures w14:val="standardContextual"/>
             </w:rPr>
           </w:pPr>
-          <w:hyperlink w:anchor="_Toc243401838" w:history="1">
+          <w:hyperlink w:anchor="_Toc243404437" w:history="1">
             <w:r>
               <w:rPr>
                 <w:rStyle w:val="Hyperlink"/>
@@ -1215,7 +1311,7 @@
                 <w:noProof/>
                 <w:webHidden/>
               </w:rPr>
-              <w:instrText xml:space="preserve"> PAGEREF _Toc243401838 \h </w:instrText>
+              <w:instrText xml:space="preserve"> PAGEREF _Toc243404437 \h </w:instrText>
             </w:r>
             <w:r>
               <w:rPr>
@@ -1261,7 +1357,7 @@
               <w14:ligatures w14:val="standardContextual"/>
             </w:rPr>
           </w:pPr>
-          <w:hyperlink w:anchor="_Toc243401839" w:history="1">
+          <w:hyperlink w:anchor="_Toc243404438" w:history="1">
             <w:r>
               <w:rPr>
                 <w:rStyle w:val="Hyperlink"/>
@@ -1289,7 +1385,7 @@
                 <w:noProof/>
                 <w:webHidden/>
               </w:rPr>
-              <w:instrText xml:space="preserve"> PAGEREF _Toc243401839 \h </w:instrText>
+              <w:instrText xml:space="preserve"> PAGEREF _Toc243404438 \h </w:instrText>
             </w:r>
             <w:r>
               <w:rPr>
@@ -1335,7 +1431,7 @@
               <w14:ligatures w14:val="standardContextual"/>
             </w:rPr>
           </w:pPr>
-          <w:hyperlink w:anchor="_Toc243401840" w:history="1">
+          <w:hyperlink w:anchor="_Toc243404439" w:history="1">
             <w:r>
               <w:rPr>
                 <w:rStyle w:val="Hyperlink"/>
@@ -1363,7 +1459,7 @@
                 <w:noProof/>
                 <w:webHidden/>
               </w:rPr>
-              <w:instrText xml:space="preserve"> PAGEREF _Toc243401840 \h </w:instrText>
+              <w:instrText xml:space="preserve"> PAGEREF _Toc243404439 \h </w:instrText>
             </w:r>
             <w:r>
               <w:rPr>
@@ -1409,7 +1505,7 @@
               <w14:ligatures w14:val="standardContextual"/>
             </w:rPr>
           </w:pPr>
-          <w:hyperlink w:anchor="_Toc243401841" w:history="1">
+          <w:hyperlink w:anchor="_Toc243404440" w:history="1">
             <w:r>
               <w:rPr>
                 <w:rStyle w:val="Hyperlink"/>
@@ -1437,7 +1533,7 @@
                 <w:noProof/>
                 <w:webHidden/>
               </w:rPr>
-              <w:instrText xml:space="preserve"> PAGEREF _Toc243401841 \h </w:instrText>
+              <w:instrText xml:space="preserve"> PAGEREF _Toc243404440 \h </w:instrText>
             </w:r>
             <w:r>
               <w:rPr>
@@ -1458,6 +1554,80 @@
                 <w:webHidden/>
               </w:rPr>
               <w:t>3</w:t>
+            </w:r>
+            <w:r>
+              <w:rPr>
+                <w:noProof/>
+                <w:webHidden/>
+              </w:rPr>
+              <w:fldChar w:fldCharType="end"/>
+            </w:r>
+          </w:hyperlink>
+        </w:p>
+        <w:p>
+          <w:pPr>
+            <w:pStyle w:val="TOC2"/>
+            <w:tabs>
+              <w:tab w:val="right" w:leader="dot" w:pos="9016"/>
+            </w:tabs>
+            <w:rPr>
+              <w:rFonts w:asciiTheme="minorHAnsi" w:eastAsiaTheme="minorEastAsia" w:hAnsiTheme="minorHAnsi" w:cstheme="minorBidi"/>
+              <w:noProof/>
+              <w:kern w:val="2"/>
+              <w:sz w:val="24"/>
+              <w:szCs w:val="24"/>
+              <w14:ligatures w14:val="standardContextual"/>
+            </w:rPr>
+          </w:pPr>
+          <w:hyperlink w:anchor="_Toc243404441" w:history="1">
+            <w:r>
+              <w:rPr>
+                <w:rStyle w:val="Hyperlink"/>
+                <w:rFonts w:eastAsia="Aptos"/>
+                <w:noProof/>
+              </w:rPr>
+              <w:t>Data Sources</w:t>
+            </w:r>
+            <w:r>
+              <w:rPr>
+                <w:noProof/>
+                <w:webHidden/>
+              </w:rPr>
+              <w:tab/>
+            </w:r>
+            <w:r>
+              <w:rPr>
+                <w:noProof/>
+                <w:webHidden/>
+              </w:rPr>
+              <w:fldChar w:fldCharType="begin"/>
+            </w:r>
+            <w:r>
+              <w:rPr>
+                <w:noProof/>
+                <w:webHidden/>
+              </w:rPr>
+              <w:instrText xml:space="preserve"> PAGEREF _Toc243404441 \h </w:instrText>
+            </w:r>
+            <w:r>
+              <w:rPr>
+                <w:noProof/>
+                <w:webHidden/>
+              </w:rPr>
+            </w:r>
+            <w:r>
+              <w:rPr>
+                <w:noProof/>
+                <w:webHidden/>
+              </w:rPr>
+              <w:fldChar w:fldCharType="separate"/>
+            </w:r>
+            <w:r>
+              <w:rPr>
+                <w:noProof/>
+                <w:webHidden/>
+              </w:rPr>
+              <w:t>5</w:t>
             </w:r>
             <w:r>
               <w:rPr>
@@ -1483,7 +1653,7 @@
               <w14:ligatures w14:val="standardContextual"/>
             </w:rPr>
           </w:pPr>
-          <w:hyperlink w:anchor="_Toc243401842" w:history="1">
+          <w:hyperlink w:anchor="_Toc243404442" w:history="1">
             <w:r>
               <w:rPr>
                 <w:rStyle w:val="Hyperlink"/>
@@ -1510,7 +1680,7 @@
                 <w:noProof/>
                 <w:webHidden/>
               </w:rPr>
-              <w:instrText xml:space="preserve"> PAGEREF _Toc243401842 \h </w:instrText>
+              <w:instrText xml:space="preserve"> PAGEREF _Toc243404442 \h </w:instrText>
             </w:r>
             <w:r>
               <w:rPr>
@@ -1556,7 +1726,7 @@
               <w14:ligatures w14:val="standardContextual"/>
             </w:rPr>
           </w:pPr>
-          <w:hyperlink w:anchor="_Toc243401843" w:history="1">
+          <w:hyperlink w:anchor="_Toc243404443" w:history="1">
             <w:r>
               <w:rPr>
                 <w:rStyle w:val="Hyperlink"/>
@@ -1583,7 +1753,7 @@
                 <w:noProof/>
                 <w:webHidden/>
               </w:rPr>
-              <w:instrText xml:space="preserve"> PAGEREF _Toc243401843 \h </w:instrText>
+              <w:instrText xml:space="preserve"> PAGEREF _Toc243404443 \h </w:instrText>
             </w:r>
             <w:r>
               <w:rPr>
@@ -1645,7 +1815,7 @@
           <w:rFonts w:eastAsia="Aptos"/>
         </w:rPr>
       </w:pPr>
-      <w:bookmarkStart w:id="0" w:name="_Toc243401836"/>
+      <w:bookmarkStart w:id="0" w:name="_Toc243404435"/>
       <w:r>
         <w:rPr>
           <w:rFonts w:eastAsia="Aptos"/>
@@ -1680,7 +1850,7 @@
           <w:rFonts w:eastAsia="Aptos"/>
         </w:rPr>
       </w:pPr>
-      <w:bookmarkStart w:id="1" w:name="_Toc243401837"/>
+      <w:bookmarkStart w:id="1" w:name="_Toc243404436"/>
       <w:r>
         <w:rPr>
           <w:rFonts w:eastAsia="Aptos"/>
@@ -1898,7 +2068,7 @@
           <w:rFonts w:eastAsia="Aptos"/>
         </w:rPr>
       </w:pPr>
-      <w:bookmarkStart w:id="2" w:name="_Toc243401838"/>
+      <w:bookmarkStart w:id="2" w:name="_Toc243404437"/>
       <w:r>
         <w:rPr>
           <w:rFonts w:eastAsia="Aptos"/>
@@ -1923,7 +2093,27 @@
           <w:sz w:val="24"/>
           <w:szCs w:val="24"/>
         </w:rPr>
-        <w:t>Thinking about our proposal, we can say that some of the challenges we will address are:</w:t>
+        <w:t xml:space="preserve">Thinking about our proposal, we can say that </w:t>
+      </w:r>
+      <w:proofErr w:type="gramStart"/>
+      <w:r>
+        <w:rPr>
+          <w:rFonts w:ascii="Aptos" w:eastAsia="Aptos" w:hAnsi="Aptos" w:cs="Aptos"/>
+          <w:bCs/>
+          <w:sz w:val="24"/>
+          <w:szCs w:val="24"/>
+        </w:rPr>
+        <w:t>some of</w:t>
+      </w:r>
+      <w:proofErr w:type="gramEnd"/>
+      <w:r>
+        <w:rPr>
+          <w:rFonts w:ascii="Aptos" w:eastAsia="Aptos" w:hAnsi="Aptos" w:cs="Aptos"/>
+          <w:bCs/>
+          <w:sz w:val="24"/>
+          <w:szCs w:val="24"/>
+        </w:rPr>
+        <w:t xml:space="preserve"> the challenges we will address are:</w:t>
       </w:r>
     </w:p>
     <w:p>
@@ -2322,7 +2512,7 @@
           <w:rFonts w:eastAsia="Aptos"/>
         </w:rPr>
       </w:pPr>
-      <w:bookmarkStart w:id="3" w:name="_Toc243401839"/>
+      <w:bookmarkStart w:id="3" w:name="_Toc243404438"/>
       <w:r>
         <w:rPr>
           <w:rFonts w:eastAsia="Aptos"/>
@@ -2348,7 +2538,15 @@
     </w:p>
     <w:p>
       <w:r>
-        <w:t xml:space="preserve">The aim of this project will be addressed by the following achievable objectives: </w:t>
+        <w:t xml:space="preserve">The aim of this project will </w:t>
+      </w:r>
+      <w:proofErr w:type="gramStart"/>
+      <w:r>
+        <w:t>be addressed</w:t>
+      </w:r>
+      <w:proofErr w:type="gramEnd"/>
+      <w:r>
+        <w:t xml:space="preserve"> by the following achievable objectives: </w:t>
       </w:r>
     </w:p>
     <w:p>
@@ -2441,7 +2639,15 @@
         <w:t>customers,</w:t>
       </w:r>
       <w:r>
-        <w:t xml:space="preserve"> we could start working on training our machine learning model and implement a prototype.</w:t>
+        <w:t xml:space="preserve"> we could start </w:t>
+      </w:r>
+      <w:proofErr w:type="gramStart"/>
+      <w:r>
+        <w:t>working on training</w:t>
+      </w:r>
+      <w:proofErr w:type="gramEnd"/>
+      <w:r>
+        <w:t xml:space="preserve"> our machine learning model and implement a prototype.</w:t>
       </w:r>
     </w:p>
     <w:p>
@@ -2478,7 +2684,23 @@
         <w:t>with respect to</w:t>
       </w:r>
       <w:r>
-        <w:t xml:space="preserve"> the desired outcome. In other words, we should test the model and see if it’s working as desired.</w:t>
+        <w:t xml:space="preserve"> the desired outcome. In other words, we should </w:t>
+      </w:r>
+      <w:proofErr w:type="gramStart"/>
+      <w:r>
+        <w:t>test</w:t>
+      </w:r>
+      <w:proofErr w:type="gramEnd"/>
+      <w:r>
+        <w:t xml:space="preserve"> the model and see if </w:t>
+      </w:r>
+      <w:proofErr w:type="gramStart"/>
+      <w:r>
+        <w:t>it’s</w:t>
+      </w:r>
+      <w:proofErr w:type="gramEnd"/>
+      <w:r>
+        <w:t xml:space="preserve"> working as desired.</w:t>
       </w:r>
     </w:p>
     <w:p>
@@ -2497,7 +2719,7 @@
           <w:rFonts w:eastAsia="Aptos"/>
         </w:rPr>
       </w:pPr>
-      <w:bookmarkStart w:id="4" w:name="_Toc243401840"/>
+      <w:bookmarkStart w:id="4" w:name="_Toc243404439"/>
       <w:r>
         <w:rPr>
           <w:rFonts w:eastAsia="Aptos"/>
@@ -2539,11 +2761,21 @@
       <w:r>
         <w:t xml:space="preserve">by training it, </w:t>
       </w:r>
+      <w:proofErr w:type="gramStart"/>
       <w:r>
         <w:t>checking</w:t>
       </w:r>
-      <w:r>
-        <w:t xml:space="preserve"> and comparing predicted results (Accuracy, F1, Recall, Precision, etc.), and making any relevant changes to its parameters to improve it. Once we finish with this, we will do a final test and send it to production.</w:t>
+      <w:proofErr w:type="gramEnd"/>
+      <w:r>
+        <w:t xml:space="preserve"> and comparing predicted results (Accuracy, F1, Recall, Precision, </w:t>
+      </w:r>
+      <w:proofErr w:type="gramStart"/>
+      <w:r>
+        <w:t>etc.</w:t>
+      </w:r>
+      <w:proofErr w:type="gramEnd"/>
+      <w:r>
+        <w:t>), and making any relevant changes to its parameters to improve it. Once we finish with this, we will do a final test and send it to production.</w:t>
       </w:r>
     </w:p>
     <w:p/>
@@ -2565,7 +2797,7 @@
           <w:rFonts w:eastAsia="Aptos"/>
         </w:rPr>
       </w:pPr>
-      <w:bookmarkStart w:id="5" w:name="_Toc243401841"/>
+      <w:bookmarkStart w:id="5" w:name="_Toc243404440"/>
       <w:r>
         <w:rPr>
           <w:rFonts w:eastAsia="Aptos"/>
@@ -2782,7 +3014,15 @@
         <w:t>Encoder</w:t>
       </w:r>
       <w:r>
-        <w:t xml:space="preserve"> is most used for Boolean features that only have 2 unique values and retrieves only “0s” and “1s”. About </w:t>
+        <w:t xml:space="preserve"> is most used for Boolean features that only have </w:t>
+      </w:r>
+      <w:proofErr w:type="gramStart"/>
+      <w:r>
+        <w:t>2</w:t>
+      </w:r>
+      <w:proofErr w:type="gramEnd"/>
+      <w:r>
+        <w:t xml:space="preserve"> unique values and retrieves only “0s” and “1s”. About </w:t>
       </w:r>
       <w:r>
         <w:rPr>
@@ -2833,7 +3073,31 @@
         <w:t>used</w:t>
       </w:r>
       <w:r>
-        <w:t xml:space="preserve"> to prevent the model from assuming any type of mathematical hierarchy or distance between categories (e.g., there is no relevant difference between “Cat”, “Dog”, and “Lamb”, but if our model read “1”,”2”, and ”3” it could think that the number 3 has some higher importance than 1 and 2, which is not the case). Finally, for </w:t>
+        <w:t xml:space="preserve"> to prevent the model from assuming any type of mathematical hierarchy or distance between categories (e.g., there is no relevant difference between “Cat</w:t>
+      </w:r>
+      <w:proofErr w:type="gramStart"/>
+      <w:r>
+        <w:t>”,</w:t>
+      </w:r>
+      <w:proofErr w:type="gramEnd"/>
+      <w:r>
+        <w:t xml:space="preserve"> “Dog</w:t>
+      </w:r>
+      <w:proofErr w:type="gramStart"/>
+      <w:r>
+        <w:t>”,</w:t>
+      </w:r>
+      <w:proofErr w:type="gramEnd"/>
+      <w:r>
+        <w:t xml:space="preserve"> and “Lamb</w:t>
+      </w:r>
+      <w:proofErr w:type="gramStart"/>
+      <w:r>
+        <w:t>”,</w:t>
+      </w:r>
+      <w:proofErr w:type="gramEnd"/>
+      <w:r>
+        <w:t xml:space="preserve"> but if our model read “1”,”2”, and ”3” it could think that the number 3 has some higher importance than 1 and 2, which is not the case). Finally, for </w:t>
       </w:r>
       <w:r>
         <w:rPr>
@@ -2843,7 +3107,23 @@
         <w:t>mapping</w:t>
       </w:r>
       <w:r>
-        <w:t>, I will use it to set Ordinal Variables Accordingly, making sure that the order between the values is correct (e.g., a feature containing the values “Employee”, “Team leader”, “Manager” and “Region Manager”).</w:t>
+        <w:t>, I will use it to set Ordinal Variables Accordingly, making sure that the order between the values is correct (e.g., a feature containing the values “Employee</w:t>
+      </w:r>
+      <w:proofErr w:type="gramStart"/>
+      <w:r>
+        <w:t>”,</w:t>
+      </w:r>
+      <w:proofErr w:type="gramEnd"/>
+      <w:r>
+        <w:t xml:space="preserve"> “Team leader</w:t>
+      </w:r>
+      <w:proofErr w:type="gramStart"/>
+      <w:r>
+        <w:t>”,</w:t>
+      </w:r>
+      <w:proofErr w:type="gramEnd"/>
+      <w:r>
+        <w:t xml:space="preserve"> “Manager” and “Region Manager”).</w:t>
       </w:r>
     </w:p>
     <w:p>
@@ -2952,6 +3232,7 @@
         <w:t>GXBoost</w:t>
       </w:r>
       <w:proofErr w:type="spellEnd"/>
+      <w:proofErr w:type="gramStart"/>
       <w:r>
         <w:t>.</w:t>
       </w:r>
@@ -2963,17 +3244,26 @@
         <w:t xml:space="preserve"> </w:t>
       </w:r>
       <w:r>
-        <w:t xml:space="preserve"> S</w:t>
+        <w:t xml:space="preserve"> </w:t>
+      </w:r>
+      <w:proofErr w:type="gramEnd"/>
+      <w:r>
+        <w:t>S</w:t>
       </w:r>
       <w:r>
         <w:t>ince</w:t>
       </w:r>
       <w:r>
-        <w:t xml:space="preserve"> we will be able to identify what type of characteristics the user like within a song (e.g., BPM, Danceability, Energy, Etc</w:t>
+        <w:t xml:space="preserve"> we will be able to identify what type of characteristics the user like within a song (e.g., BPM, Danceability, Energy, </w:t>
+      </w:r>
+      <w:proofErr w:type="gramStart"/>
+      <w:r>
+        <w:t>Etc</w:t>
       </w:r>
       <w:r>
         <w:t>.</w:t>
       </w:r>
+      <w:proofErr w:type="gramEnd"/>
       <w:r>
         <w:t>)</w:t>
       </w:r>
@@ -3069,11 +3359,265 @@
           <w:rFonts w:eastAsia="Aptos"/>
         </w:rPr>
       </w:pPr>
+      <w:bookmarkStart w:id="6" w:name="_Toc243404441"/>
       <w:r>
         <w:rPr>
           <w:rFonts w:eastAsia="Aptos"/>
         </w:rPr>
         <w:t>Data Sources</w:t>
+      </w:r>
+      <w:bookmarkEnd w:id="6"/>
+    </w:p>
+    <w:p>
+      <w:r>
+        <w:t xml:space="preserve">In my research for different data sources for this project, I have found </w:t>
+      </w:r>
+      <w:proofErr w:type="gramStart"/>
+      <w:r>
+        <w:t>some</w:t>
+      </w:r>
+      <w:proofErr w:type="gramEnd"/>
+      <w:r>
+        <w:t xml:space="preserve"> </w:t>
+      </w:r>
+      <w:proofErr w:type="gramStart"/>
+      <w:r>
+        <w:t>really interesting</w:t>
+      </w:r>
+      <w:proofErr w:type="gramEnd"/>
+      <w:r>
+        <w:t xml:space="preserve"> options; I will list bellow using bullet points and mentioning the origin of </w:t>
+      </w:r>
+      <w:r>
+        <w:t>them</w:t>
+      </w:r>
+      <w:r>
+        <w:t>.</w:t>
+      </w:r>
+    </w:p>
+    <w:p>
+      <w:pPr>
+        <w:pStyle w:val="ListParagraph"/>
+        <w:numPr>
+          <w:ilvl w:val="0"/>
+          <w:numId w:val="12"/>
+        </w:numPr>
+        <w:rPr>
+          <w:i/>
+          <w:iCs/>
+        </w:rPr>
+      </w:pPr>
+      <w:r>
+        <w:rPr>
+          <w:i/>
+          <w:iCs/>
+        </w:rPr>
+        <w:t xml:space="preserve">Kaggle: </w:t>
+      </w:r>
+      <w:r>
+        <w:rPr>
+          <w:i/>
+          <w:iCs/>
+        </w:rPr>
+        <w:t> </w:t>
+      </w:r>
+      <w:hyperlink r:id="rId16" w:history="1">
+        <w:r>
+          <w:rPr>
+            <w:rStyle w:val="Hyperlink"/>
+            <w:i/>
+            <w:iCs/>
+          </w:rPr>
+          <w:t>Dataset 1</w:t>
+        </w:r>
+      </w:hyperlink>
+      <w:r>
+        <w:rPr>
+          <w:i/>
+          <w:iCs/>
+        </w:rPr>
+        <w:t xml:space="preserve">. </w:t>
+      </w:r>
+      <w:proofErr w:type="gramStart"/>
+      <w:r>
+        <w:t>It’s</w:t>
+      </w:r>
+      <w:proofErr w:type="gramEnd"/>
+      <w:r>
+        <w:t xml:space="preserve"> a CSV file that contains over 20.000 records featuring song metadata, such as energy, danceability, loudness, and duration. The dataset </w:t>
+      </w:r>
+      <w:proofErr w:type="gramStart"/>
+      <w:r>
+        <w:t>is licensed</w:t>
+      </w:r>
+      <w:proofErr w:type="gramEnd"/>
+      <w:r>
+        <w:t xml:space="preserve"> under the </w:t>
+      </w:r>
+      <w:hyperlink r:id="rId17" w:history="1">
+        <w:r>
+          <w:rPr>
+            <w:rStyle w:val="Hyperlink"/>
+          </w:rPr>
+          <w:t>ODC Public Domain Dedication and License (PDDL)</w:t>
+        </w:r>
+      </w:hyperlink>
+      <w:r>
+        <w:t>, meaning that it is free of copyright restrictions and available for use in our project. The file has key variables for building our recommendation system.</w:t>
+      </w:r>
+    </w:p>
+    <w:p>
+      <w:pPr>
+        <w:pStyle w:val="ListParagraph"/>
+        <w:numPr>
+          <w:ilvl w:val="0"/>
+          <w:numId w:val="12"/>
+        </w:numPr>
+        <w:rPr>
+          <w:i/>
+          <w:iCs/>
+        </w:rPr>
+      </w:pPr>
+      <w:r>
+        <w:rPr>
+          <w:i/>
+          <w:iCs/>
+        </w:rPr>
+        <w:t xml:space="preserve">Kaggle: </w:t>
+      </w:r>
+      <w:hyperlink r:id="rId18" w:history="1">
+        <w:r>
+          <w:rPr>
+            <w:rStyle w:val="Hyperlink"/>
+            <w:i/>
+            <w:iCs/>
+          </w:rPr>
+          <w:t>Dataset 2</w:t>
+        </w:r>
+      </w:hyperlink>
+      <w:r>
+        <w:rPr>
+          <w:i/>
+          <w:iCs/>
+        </w:rPr>
+        <w:t xml:space="preserve">. </w:t>
+      </w:r>
+      <w:proofErr w:type="gramStart"/>
+      <w:r>
+        <w:rPr>
+          <w:i/>
+          <w:iCs/>
+        </w:rPr>
+        <w:t>It’s</w:t>
+      </w:r>
+      <w:proofErr w:type="gramEnd"/>
+      <w:r>
+        <w:rPr>
+          <w:i/>
+          <w:iCs/>
+        </w:rPr>
+        <w:t xml:space="preserve"> also a CSV file with </w:t>
+      </w:r>
+      <w:proofErr w:type="gramStart"/>
+      <w:r>
+        <w:rPr>
+          <w:i/>
+          <w:iCs/>
+        </w:rPr>
+        <w:t>nearly 600.000</w:t>
+      </w:r>
+      <w:proofErr w:type="gramEnd"/>
+      <w:r>
+        <w:rPr>
+          <w:i/>
+          <w:iCs/>
+        </w:rPr>
+        <w:t xml:space="preserve"> records featuring song metadata. The dataset </w:t>
+      </w:r>
+      <w:proofErr w:type="gramStart"/>
+      <w:r>
+        <w:rPr>
+          <w:i/>
+          <w:iCs/>
+        </w:rPr>
+        <w:t>is licensed</w:t>
+      </w:r>
+      <w:proofErr w:type="gramEnd"/>
+      <w:r>
+        <w:rPr>
+          <w:i/>
+          <w:iCs/>
+        </w:rPr>
+        <w:t xml:space="preserve"> under the Community Data License Agreement – </w:t>
+      </w:r>
+      <w:proofErr w:type="gramStart"/>
+      <w:r>
+        <w:rPr>
+          <w:i/>
+          <w:iCs/>
+        </w:rPr>
+        <w:t>Sharing ,</w:t>
+      </w:r>
+      <w:proofErr w:type="gramEnd"/>
+      <w:r>
+        <w:rPr>
+          <w:i/>
+          <w:iCs/>
+        </w:rPr>
+        <w:t xml:space="preserve"> Version 1.0, Meaning that </w:t>
+      </w:r>
+      <w:proofErr w:type="gramStart"/>
+      <w:r>
+        <w:rPr>
+          <w:i/>
+          <w:iCs/>
+        </w:rPr>
+        <w:t>It’s</w:t>
+      </w:r>
+      <w:proofErr w:type="gramEnd"/>
+      <w:r>
+        <w:rPr>
+          <w:i/>
+          <w:iCs/>
+        </w:rPr>
+        <w:t xml:space="preserve"> copyright-free, I can use it for my project and to train my machine learning models.</w:t>
+      </w:r>
+    </w:p>
+    <w:p>
+      <w:pPr>
+        <w:pStyle w:val="ListParagraph"/>
+        <w:numPr>
+          <w:ilvl w:val="0"/>
+          <w:numId w:val="12"/>
+        </w:numPr>
+        <w:rPr>
+          <w:i/>
+          <w:iCs/>
+        </w:rPr>
+      </w:pPr>
+      <w:r>
+        <w:rPr>
+          <w:i/>
+          <w:iCs/>
+        </w:rPr>
+        <w:t xml:space="preserve">Kaggle: </w:t>
+      </w:r>
+      <w:hyperlink r:id="rId19" w:history="1">
+        <w:r>
+          <w:rPr>
+            <w:rStyle w:val="Hyperlink"/>
+            <w:i/>
+            <w:iCs/>
+          </w:rPr>
+          <w:t>Dataset 3</w:t>
+        </w:r>
+      </w:hyperlink>
+      <w:r>
+        <w:rPr>
+          <w:i/>
+          <w:iCs/>
+        </w:rPr>
+        <w:t xml:space="preserve">. </w:t>
       </w:r>
     </w:p>
     <w:p/>
@@ -3086,11 +3630,11 @@
       <w:pPr>
         <w:pStyle w:val="Heading1"/>
       </w:pPr>
-      <w:bookmarkStart w:id="6" w:name="_Toc243401842"/>
+      <w:bookmarkStart w:id="7" w:name="_Toc243404442"/>
       <w:r>
         <w:t>References</w:t>
       </w:r>
-      <w:bookmarkEnd w:id="6"/>
+      <w:bookmarkEnd w:id="7"/>
     </w:p>
     <w:p/>
     <w:p>
@@ -3103,8 +3647,16 @@
         <w:rPr>
           <w:color w:val="FF0000"/>
         </w:rPr>
-        <w:t>Please list all the references you have used in your assignment alphabetically and in the Harvard style. You can find information on how to correctly reference in Harvard at this link: https://library.cct.ie/referencing/harvard</w:t>
-      </w:r>
+        <w:t xml:space="preserve">Please list all the references you have used in your assignment alphabetically and in the Harvard style. You can find information on how to correctly reference in Harvard at this link: </w:t>
+      </w:r>
+      <w:proofErr w:type="gramStart"/>
+      <w:r>
+        <w:rPr>
+          <w:color w:val="FF0000"/>
+        </w:rPr>
+        <w:t>https://library.cct.ie/referencing/harvard</w:t>
+      </w:r>
+      <w:proofErr w:type="gramEnd"/>
     </w:p>
     <w:p/>
     <w:p/>
@@ -3152,13 +3704,13 @@
       <w:pPr>
         <w:pStyle w:val="Heading1"/>
       </w:pPr>
-      <w:bookmarkStart w:id="7" w:name="_heading=h.kfkjs3rwl2c1" w:colFirst="0" w:colLast="0"/>
-      <w:bookmarkStart w:id="8" w:name="_Toc243401843"/>
-      <w:bookmarkEnd w:id="7"/>
+      <w:bookmarkStart w:id="8" w:name="_heading=h.kfkjs3rwl2c1" w:colFirst="0" w:colLast="0"/>
+      <w:bookmarkStart w:id="9" w:name="_Toc243404443"/>
+      <w:bookmarkEnd w:id="8"/>
       <w:r>
         <w:t>Appendix</w:t>
       </w:r>
-      <w:bookmarkEnd w:id="8"/>
+      <w:bookmarkEnd w:id="9"/>
     </w:p>
     <w:p/>
     <w:p>
@@ -3191,7 +3743,21 @@
         <w:rPr>
           <w:color w:val="FF0000"/>
         </w:rPr>
-        <w:t>The appendix serves as a repository for additional or supplementary information that is deemed too extensive or detailed for integration into the main body of the text. This supplementary content can encompass data tables, charts, graphs, questionnaires, or any other supporting materials that contribute to a comprehensive understanding of the research.</w:t>
+        <w:t xml:space="preserve">The appendix serves as a repository for additional or supplementary information that </w:t>
+      </w:r>
+      <w:proofErr w:type="gramStart"/>
+      <w:r>
+        <w:rPr>
+          <w:color w:val="FF0000"/>
+        </w:rPr>
+        <w:t>is deemed</w:t>
+      </w:r>
+      <w:proofErr w:type="gramEnd"/>
+      <w:r>
+        <w:rPr>
+          <w:color w:val="FF0000"/>
+        </w:rPr>
+        <w:t xml:space="preserve"> too extensive or detailed for integration into the main body of the text. This supplementary content can encompass data tables, charts, graphs, questionnaires, or any other supporting materials that contribute to a comprehensive understanding of the research.</w:t>
       </w:r>
     </w:p>
     <w:p>
@@ -3204,7 +3770,35 @@
         <w:rPr>
           <w:color w:val="FF0000"/>
         </w:rPr>
-        <w:t>If you haven't used AI tools and there's no need for supplementary data, you can remove the appendix section entirely.</w:t>
+        <w:t xml:space="preserve">If you </w:t>
+      </w:r>
+      <w:proofErr w:type="gramStart"/>
+      <w:r>
+        <w:rPr>
+          <w:color w:val="FF0000"/>
+        </w:rPr>
+        <w:t>haven't</w:t>
+      </w:r>
+      <w:proofErr w:type="gramEnd"/>
+      <w:r>
+        <w:rPr>
+          <w:color w:val="FF0000"/>
+        </w:rPr>
+        <w:t xml:space="preserve"> used AI tools and </w:t>
+      </w:r>
+      <w:proofErr w:type="gramStart"/>
+      <w:r>
+        <w:rPr>
+          <w:color w:val="FF0000"/>
+        </w:rPr>
+        <w:t>there's</w:t>
+      </w:r>
+      <w:proofErr w:type="gramEnd"/>
+      <w:r>
+        <w:rPr>
+          <w:color w:val="FF0000"/>
+        </w:rPr>
+        <w:t xml:space="preserve"> no need for supplementary data, you can remove the appendix section entirely.</w:t>
       </w:r>
     </w:p>
     <w:p>
@@ -3216,7 +3810,7 @@
     </w:p>
     <w:p/>
     <w:sectPr>
-      <w:footerReference w:type="default" r:id="rId16"/>
+      <w:footerReference w:type="default" r:id="rId20"/>
       <w:pgSz w:w="11906" w:h="16838"/>
       <w:pgMar w:top="1440" w:right="1440" w:bottom="1440" w:left="1440" w:header="708" w:footer="708" w:gutter="0"/>
       <w:pgBorders w:offsetFrom="page">
@@ -6570,6 +7164,18 @@
       <w:spacing w:after="0" w:line="240" w:lineRule="auto"/>
     </w:pPr>
   </w:style>
+  <w:style w:type="character" w:styleId="UnresolvedMention">
+    <w:name w:val="Unresolved Mention"/>
+    <w:basedOn w:val="DefaultParagraphFont"/>
+    <w:uiPriority w:val="99"/>
+    <w:semiHidden/>
+    <w:unhideWhenUsed/>
+    <w:rsid w:val="00E76FAB"/>
+    <w:rPr>
+      <w:color w:val="605E5C"/>
+      <w:shd w:val="clear" w:color="auto" w:fill="E1DFDD"/>
+    </w:rPr>
+  </w:style>
 </w:styles>
 </file>
 

</xml_diff>

<commit_message>
Commit 7:  Expected deliverables and project timeline
Today, 22 of October, I wrote about the expected deliverables and project timeline.
</commit_message>
<xml_diff>
--- a/SA25074_CA1_ Strategic_Thinking_v1.docx
+++ b/SA25074_CA1_ Strategic_Thinking_v1.docx
@@ -883,23 +883,7 @@
                                 <w:color w:val="000000"/>
                                 <w:sz w:val="28"/>
                               </w:rPr>
-                              <w:t xml:space="preserve">I declare it to be my own work and that all material from third parties has </w:t>
-                            </w:r>
-                            <w:proofErr w:type="gramStart"/>
-                            <w:r>
-                              <w:rPr>
-                                <w:color w:val="000000"/>
-                                <w:sz w:val="28"/>
-                              </w:rPr>
-                              <w:t>been appropriately referenced</w:t>
-                            </w:r>
-                            <w:proofErr w:type="gramEnd"/>
-                            <w:r>
-                              <w:rPr>
-                                <w:color w:val="000000"/>
-                                <w:sz w:val="28"/>
-                              </w:rPr>
-                              <w:t>.</w:t>
+                              <w:t>I declare it to be my own work and that all material from third parties has been appropriately referenced.</w:t>
                             </w:r>
                           </w:p>
                           <w:p>
@@ -912,23 +896,7 @@
                                 <w:color w:val="000000"/>
                                 <w:sz w:val="28"/>
                               </w:rPr>
-                              <w:t xml:space="preserve"> I further confirm that this work has not previously </w:t>
-                            </w:r>
-                            <w:proofErr w:type="gramStart"/>
-                            <w:r>
-                              <w:rPr>
-                                <w:color w:val="000000"/>
-                                <w:sz w:val="28"/>
-                              </w:rPr>
-                              <w:t>been submitted</w:t>
-                            </w:r>
-                            <w:proofErr w:type="gramEnd"/>
-                            <w:r>
-                              <w:rPr>
-                                <w:color w:val="000000"/>
-                                <w:sz w:val="28"/>
-                              </w:rPr>
-                              <w:t xml:space="preserve"> for assessment by myself or someone else in CCT College Dublin or any other higher education institution.</w:t>
+                              <w:t xml:space="preserve"> I further confirm that this work has not previously been submitted for assessment by myself or someone else in CCT College Dublin or any other higher education institution.</w:t>
                             </w:r>
                           </w:p>
                         </w:txbxContent>
@@ -1001,23 +969,7 @@
                           <w:color w:val="000000"/>
                           <w:sz w:val="28"/>
                         </w:rPr>
-                        <w:t xml:space="preserve">I declare it to be my own work and that all material from third parties has </w:t>
-                      </w:r>
-                      <w:proofErr w:type="gramStart"/>
-                      <w:r>
-                        <w:rPr>
-                          <w:color w:val="000000"/>
-                          <w:sz w:val="28"/>
-                        </w:rPr>
-                        <w:t>been appropriately referenced</w:t>
-                      </w:r>
-                      <w:proofErr w:type="gramEnd"/>
-                      <w:r>
-                        <w:rPr>
-                          <w:color w:val="000000"/>
-                          <w:sz w:val="28"/>
-                        </w:rPr>
-                        <w:t>.</w:t>
+                        <w:t>I declare it to be my own work and that all material from third parties has been appropriately referenced.</w:t>
                       </w:r>
                     </w:p>
                     <w:p>
@@ -1030,23 +982,7 @@
                           <w:color w:val="000000"/>
                           <w:sz w:val="28"/>
                         </w:rPr>
-                        <w:t xml:space="preserve"> I further confirm that this work has not previously </w:t>
-                      </w:r>
-                      <w:proofErr w:type="gramStart"/>
-                      <w:r>
-                        <w:rPr>
-                          <w:color w:val="000000"/>
-                          <w:sz w:val="28"/>
-                        </w:rPr>
-                        <w:t>been submitted</w:t>
-                      </w:r>
-                      <w:proofErr w:type="gramEnd"/>
-                      <w:r>
-                        <w:rPr>
-                          <w:color w:val="000000"/>
-                          <w:sz w:val="28"/>
-                        </w:rPr>
-                        <w:t xml:space="preserve"> for assessment by myself or someone else in CCT College Dublin or any other higher education institution.</w:t>
+                        <w:t xml:space="preserve"> I further confirm that this work has not previously been submitted for assessment by myself or someone else in CCT College Dublin or any other higher education institution.</w:t>
                       </w:r>
                     </w:p>
                   </w:txbxContent>
@@ -1135,7 +1071,7 @@
           <w:r>
             <w:fldChar w:fldCharType="separate"/>
           </w:r>
-          <w:hyperlink w:anchor="_Toc243404435" w:history="1">
+          <w:hyperlink w:anchor="_Toc243481747" w:history="1">
             <w:r>
               <w:rPr>
                 <w:rStyle w:val="Hyperlink"/>
@@ -1163,7 +1099,7 @@
                 <w:noProof/>
                 <w:webHidden/>
               </w:rPr>
-              <w:instrText xml:space="preserve"> PAGEREF _Toc243404435 \h </w:instrText>
+              <w:instrText xml:space="preserve"> PAGEREF _Toc243481747 \h </w:instrText>
             </w:r>
             <w:r>
               <w:rPr>
@@ -1209,7 +1145,7 @@
               <w14:ligatures w14:val="standardContextual"/>
             </w:rPr>
           </w:pPr>
-          <w:hyperlink w:anchor="_Toc243404436" w:history="1">
+          <w:hyperlink w:anchor="_Toc243481748" w:history="1">
             <w:r>
               <w:rPr>
                 <w:rStyle w:val="Hyperlink"/>
@@ -1237,7 +1173,7 @@
                 <w:noProof/>
                 <w:webHidden/>
               </w:rPr>
-              <w:instrText xml:space="preserve"> PAGEREF _Toc243404436 \h </w:instrText>
+              <w:instrText xml:space="preserve"> PAGEREF _Toc243481748 \h </w:instrText>
             </w:r>
             <w:r>
               <w:rPr>
@@ -1283,7 +1219,7 @@
               <w14:ligatures w14:val="standardContextual"/>
             </w:rPr>
           </w:pPr>
-          <w:hyperlink w:anchor="_Toc243404437" w:history="1">
+          <w:hyperlink w:anchor="_Toc243481749" w:history="1">
             <w:r>
               <w:rPr>
                 <w:rStyle w:val="Hyperlink"/>
@@ -1311,7 +1247,7 @@
                 <w:noProof/>
                 <w:webHidden/>
               </w:rPr>
-              <w:instrText xml:space="preserve"> PAGEREF _Toc243404437 \h </w:instrText>
+              <w:instrText xml:space="preserve"> PAGEREF _Toc243481749 \h </w:instrText>
             </w:r>
             <w:r>
               <w:rPr>
@@ -1357,7 +1293,7 @@
               <w14:ligatures w14:val="standardContextual"/>
             </w:rPr>
           </w:pPr>
-          <w:hyperlink w:anchor="_Toc243404438" w:history="1">
+          <w:hyperlink w:anchor="_Toc243481750" w:history="1">
             <w:r>
               <w:rPr>
                 <w:rStyle w:val="Hyperlink"/>
@@ -1385,7 +1321,7 @@
                 <w:noProof/>
                 <w:webHidden/>
               </w:rPr>
-              <w:instrText xml:space="preserve"> PAGEREF _Toc243404438 \h </w:instrText>
+              <w:instrText xml:space="preserve"> PAGEREF _Toc243481750 \h </w:instrText>
             </w:r>
             <w:r>
               <w:rPr>
@@ -1431,7 +1367,7 @@
               <w14:ligatures w14:val="standardContextual"/>
             </w:rPr>
           </w:pPr>
-          <w:hyperlink w:anchor="_Toc243404439" w:history="1">
+          <w:hyperlink w:anchor="_Toc243481751" w:history="1">
             <w:r>
               <w:rPr>
                 <w:rStyle w:val="Hyperlink"/>
@@ -1459,7 +1395,7 @@
                 <w:noProof/>
                 <w:webHidden/>
               </w:rPr>
-              <w:instrText xml:space="preserve"> PAGEREF _Toc243404439 \h </w:instrText>
+              <w:instrText xml:space="preserve"> PAGEREF _Toc243481751 \h </w:instrText>
             </w:r>
             <w:r>
               <w:rPr>
@@ -1505,7 +1441,7 @@
               <w14:ligatures w14:val="standardContextual"/>
             </w:rPr>
           </w:pPr>
-          <w:hyperlink w:anchor="_Toc243404440" w:history="1">
+          <w:hyperlink w:anchor="_Toc243481752" w:history="1">
             <w:r>
               <w:rPr>
                 <w:rStyle w:val="Hyperlink"/>
@@ -1533,7 +1469,7 @@
                 <w:noProof/>
                 <w:webHidden/>
               </w:rPr>
-              <w:instrText xml:space="preserve"> PAGEREF _Toc243404440 \h </w:instrText>
+              <w:instrText xml:space="preserve"> PAGEREF _Toc243481752 \h </w:instrText>
             </w:r>
             <w:r>
               <w:rPr>
@@ -1579,7 +1515,7 @@
               <w14:ligatures w14:val="standardContextual"/>
             </w:rPr>
           </w:pPr>
-          <w:hyperlink w:anchor="_Toc243404441" w:history="1">
+          <w:hyperlink w:anchor="_Toc243481753" w:history="1">
             <w:r>
               <w:rPr>
                 <w:rStyle w:val="Hyperlink"/>
@@ -1607,7 +1543,7 @@
                 <w:noProof/>
                 <w:webHidden/>
               </w:rPr>
-              <w:instrText xml:space="preserve"> PAGEREF _Toc243404441 \h </w:instrText>
+              <w:instrText xml:space="preserve"> PAGEREF _Toc243481753 \h </w:instrText>
             </w:r>
             <w:r>
               <w:rPr>
@@ -1628,6 +1564,228 @@
                 <w:webHidden/>
               </w:rPr>
               <w:t>5</w:t>
+            </w:r>
+            <w:r>
+              <w:rPr>
+                <w:noProof/>
+                <w:webHidden/>
+              </w:rPr>
+              <w:fldChar w:fldCharType="end"/>
+            </w:r>
+          </w:hyperlink>
+        </w:p>
+        <w:p>
+          <w:pPr>
+            <w:pStyle w:val="TOC2"/>
+            <w:tabs>
+              <w:tab w:val="right" w:leader="dot" w:pos="9016"/>
+            </w:tabs>
+            <w:rPr>
+              <w:rFonts w:asciiTheme="minorHAnsi" w:eastAsiaTheme="minorEastAsia" w:hAnsiTheme="minorHAnsi" w:cstheme="minorBidi"/>
+              <w:noProof/>
+              <w:kern w:val="2"/>
+              <w:sz w:val="24"/>
+              <w:szCs w:val="24"/>
+              <w14:ligatures w14:val="standardContextual"/>
+            </w:rPr>
+          </w:pPr>
+          <w:hyperlink w:anchor="_Toc243481754" w:history="1">
+            <w:r>
+              <w:rPr>
+                <w:rStyle w:val="Hyperlink"/>
+                <w:rFonts w:eastAsia="Aptos"/>
+                <w:noProof/>
+              </w:rPr>
+              <w:t>Expected Deliverables</w:t>
+            </w:r>
+            <w:r>
+              <w:rPr>
+                <w:noProof/>
+                <w:webHidden/>
+              </w:rPr>
+              <w:tab/>
+            </w:r>
+            <w:r>
+              <w:rPr>
+                <w:noProof/>
+                <w:webHidden/>
+              </w:rPr>
+              <w:fldChar w:fldCharType="begin"/>
+            </w:r>
+            <w:r>
+              <w:rPr>
+                <w:noProof/>
+                <w:webHidden/>
+              </w:rPr>
+              <w:instrText xml:space="preserve"> PAGEREF _Toc243481754 \h </w:instrText>
+            </w:r>
+            <w:r>
+              <w:rPr>
+                <w:noProof/>
+                <w:webHidden/>
+              </w:rPr>
+            </w:r>
+            <w:r>
+              <w:rPr>
+                <w:noProof/>
+                <w:webHidden/>
+              </w:rPr>
+              <w:fldChar w:fldCharType="separate"/>
+            </w:r>
+            <w:r>
+              <w:rPr>
+                <w:noProof/>
+                <w:webHidden/>
+              </w:rPr>
+              <w:t>5</w:t>
+            </w:r>
+            <w:r>
+              <w:rPr>
+                <w:noProof/>
+                <w:webHidden/>
+              </w:rPr>
+              <w:fldChar w:fldCharType="end"/>
+            </w:r>
+          </w:hyperlink>
+        </w:p>
+        <w:p>
+          <w:pPr>
+            <w:pStyle w:val="TOC2"/>
+            <w:tabs>
+              <w:tab w:val="right" w:leader="dot" w:pos="9016"/>
+            </w:tabs>
+            <w:rPr>
+              <w:rFonts w:asciiTheme="minorHAnsi" w:eastAsiaTheme="minorEastAsia" w:hAnsiTheme="minorHAnsi" w:cstheme="minorBidi"/>
+              <w:noProof/>
+              <w:kern w:val="2"/>
+              <w:sz w:val="24"/>
+              <w:szCs w:val="24"/>
+              <w14:ligatures w14:val="standardContextual"/>
+            </w:rPr>
+          </w:pPr>
+          <w:hyperlink w:anchor="_Toc243481755" w:history="1">
+            <w:r>
+              <w:rPr>
+                <w:rStyle w:val="Hyperlink"/>
+                <w:rFonts w:eastAsia="Aptos"/>
+                <w:noProof/>
+              </w:rPr>
+              <w:t>Project Timeline</w:t>
+            </w:r>
+            <w:r>
+              <w:rPr>
+                <w:noProof/>
+                <w:webHidden/>
+              </w:rPr>
+              <w:tab/>
+            </w:r>
+            <w:r>
+              <w:rPr>
+                <w:noProof/>
+                <w:webHidden/>
+              </w:rPr>
+              <w:fldChar w:fldCharType="begin"/>
+            </w:r>
+            <w:r>
+              <w:rPr>
+                <w:noProof/>
+                <w:webHidden/>
+              </w:rPr>
+              <w:instrText xml:space="preserve"> PAGEREF _Toc243481755 \h </w:instrText>
+            </w:r>
+            <w:r>
+              <w:rPr>
+                <w:noProof/>
+                <w:webHidden/>
+              </w:rPr>
+            </w:r>
+            <w:r>
+              <w:rPr>
+                <w:noProof/>
+                <w:webHidden/>
+              </w:rPr>
+              <w:fldChar w:fldCharType="separate"/>
+            </w:r>
+            <w:r>
+              <w:rPr>
+                <w:noProof/>
+                <w:webHidden/>
+              </w:rPr>
+              <w:t>5</w:t>
+            </w:r>
+            <w:r>
+              <w:rPr>
+                <w:noProof/>
+                <w:webHidden/>
+              </w:rPr>
+              <w:fldChar w:fldCharType="end"/>
+            </w:r>
+          </w:hyperlink>
+        </w:p>
+        <w:p>
+          <w:pPr>
+            <w:pStyle w:val="TOC2"/>
+            <w:tabs>
+              <w:tab w:val="right" w:leader="dot" w:pos="9016"/>
+            </w:tabs>
+            <w:rPr>
+              <w:rFonts w:asciiTheme="minorHAnsi" w:eastAsiaTheme="minorEastAsia" w:hAnsiTheme="minorHAnsi" w:cstheme="minorBidi"/>
+              <w:noProof/>
+              <w:kern w:val="2"/>
+              <w:sz w:val="24"/>
+              <w:szCs w:val="24"/>
+              <w14:ligatures w14:val="standardContextual"/>
+            </w:rPr>
+          </w:pPr>
+          <w:hyperlink w:anchor="_Toc243481756" w:history="1">
+            <w:r>
+              <w:rPr>
+                <w:rStyle w:val="Hyperlink"/>
+                <w:rFonts w:eastAsia="Aptos"/>
+                <w:noProof/>
+              </w:rPr>
+              <w:t>Ethical and Legal Considerations</w:t>
+            </w:r>
+            <w:r>
+              <w:rPr>
+                <w:noProof/>
+                <w:webHidden/>
+              </w:rPr>
+              <w:tab/>
+            </w:r>
+            <w:r>
+              <w:rPr>
+                <w:noProof/>
+                <w:webHidden/>
+              </w:rPr>
+              <w:fldChar w:fldCharType="begin"/>
+            </w:r>
+            <w:r>
+              <w:rPr>
+                <w:noProof/>
+                <w:webHidden/>
+              </w:rPr>
+              <w:instrText xml:space="preserve"> PAGEREF _Toc243481756 \h </w:instrText>
+            </w:r>
+            <w:r>
+              <w:rPr>
+                <w:noProof/>
+                <w:webHidden/>
+              </w:rPr>
+            </w:r>
+            <w:r>
+              <w:rPr>
+                <w:noProof/>
+                <w:webHidden/>
+              </w:rPr>
+              <w:fldChar w:fldCharType="separate"/>
+            </w:r>
+            <w:r>
+              <w:rPr>
+                <w:noProof/>
+                <w:webHidden/>
+              </w:rPr>
+              <w:t>6</w:t>
             </w:r>
             <w:r>
               <w:rPr>
@@ -1653,7 +1811,7 @@
               <w14:ligatures w14:val="standardContextual"/>
             </w:rPr>
           </w:pPr>
-          <w:hyperlink w:anchor="_Toc243404442" w:history="1">
+          <w:hyperlink w:anchor="_Toc243481757" w:history="1">
             <w:r>
               <w:rPr>
                 <w:rStyle w:val="Hyperlink"/>
@@ -1680,7 +1838,7 @@
                 <w:noProof/>
                 <w:webHidden/>
               </w:rPr>
-              <w:instrText xml:space="preserve"> PAGEREF _Toc243404442 \h </w:instrText>
+              <w:instrText xml:space="preserve"> PAGEREF _Toc243481757 \h </w:instrText>
             </w:r>
             <w:r>
               <w:rPr>
@@ -1700,7 +1858,7 @@
                 <w:noProof/>
                 <w:webHidden/>
               </w:rPr>
-              <w:t>5</w:t>
+              <w:t>6</w:t>
             </w:r>
             <w:r>
               <w:rPr>
@@ -1726,7 +1884,7 @@
               <w14:ligatures w14:val="standardContextual"/>
             </w:rPr>
           </w:pPr>
-          <w:hyperlink w:anchor="_Toc243404443" w:history="1">
+          <w:hyperlink w:anchor="_Toc243481758" w:history="1">
             <w:r>
               <w:rPr>
                 <w:rStyle w:val="Hyperlink"/>
@@ -1753,7 +1911,7 @@
                 <w:noProof/>
                 <w:webHidden/>
               </w:rPr>
-              <w:instrText xml:space="preserve"> PAGEREF _Toc243404443 \h </w:instrText>
+              <w:instrText xml:space="preserve"> PAGEREF _Toc243481758 \h </w:instrText>
             </w:r>
             <w:r>
               <w:rPr>
@@ -1773,7 +1931,7 @@
                 <w:noProof/>
                 <w:webHidden/>
               </w:rPr>
-              <w:t>6</w:t>
+              <w:t>7</w:t>
             </w:r>
             <w:r>
               <w:rPr>
@@ -1815,7 +1973,7 @@
           <w:rFonts w:eastAsia="Aptos"/>
         </w:rPr>
       </w:pPr>
-      <w:bookmarkStart w:id="0" w:name="_Toc243404435"/>
+      <w:bookmarkStart w:id="0" w:name="_Toc243481747"/>
       <w:r>
         <w:rPr>
           <w:rFonts w:eastAsia="Aptos"/>
@@ -1850,7 +2008,7 @@
           <w:rFonts w:eastAsia="Aptos"/>
         </w:rPr>
       </w:pPr>
-      <w:bookmarkStart w:id="1" w:name="_Toc243404436"/>
+      <w:bookmarkStart w:id="1" w:name="_Toc243481748"/>
       <w:r>
         <w:rPr>
           <w:rFonts w:eastAsia="Aptos"/>
@@ -2068,7 +2226,7 @@
           <w:rFonts w:eastAsia="Aptos"/>
         </w:rPr>
       </w:pPr>
-      <w:bookmarkStart w:id="2" w:name="_Toc243404437"/>
+      <w:bookmarkStart w:id="2" w:name="_Toc243481749"/>
       <w:r>
         <w:rPr>
           <w:rFonts w:eastAsia="Aptos"/>
@@ -2093,27 +2251,7 @@
           <w:sz w:val="24"/>
           <w:szCs w:val="24"/>
         </w:rPr>
-        <w:t xml:space="preserve">Thinking about our proposal, we can say that </w:t>
-      </w:r>
-      <w:proofErr w:type="gramStart"/>
-      <w:r>
-        <w:rPr>
-          <w:rFonts w:ascii="Aptos" w:eastAsia="Aptos" w:hAnsi="Aptos" w:cs="Aptos"/>
-          <w:bCs/>
-          <w:sz w:val="24"/>
-          <w:szCs w:val="24"/>
-        </w:rPr>
-        <w:t>some of</w:t>
-      </w:r>
-      <w:proofErr w:type="gramEnd"/>
-      <w:r>
-        <w:rPr>
-          <w:rFonts w:ascii="Aptos" w:eastAsia="Aptos" w:hAnsi="Aptos" w:cs="Aptos"/>
-          <w:bCs/>
-          <w:sz w:val="24"/>
-          <w:szCs w:val="24"/>
-        </w:rPr>
-        <w:t xml:space="preserve"> the challenges we will address are:</w:t>
+        <w:t>Thinking about our proposal, we can say that some of the challenges we will address are:</w:t>
       </w:r>
     </w:p>
     <w:p>
@@ -2512,7 +2650,7 @@
           <w:rFonts w:eastAsia="Aptos"/>
         </w:rPr>
       </w:pPr>
-      <w:bookmarkStart w:id="3" w:name="_Toc243404438"/>
+      <w:bookmarkStart w:id="3" w:name="_Toc243481750"/>
       <w:r>
         <w:rPr>
           <w:rFonts w:eastAsia="Aptos"/>
@@ -2538,15 +2676,7 @@
     </w:p>
     <w:p>
       <w:r>
-        <w:t xml:space="preserve">The aim of this project will </w:t>
-      </w:r>
-      <w:proofErr w:type="gramStart"/>
-      <w:r>
-        <w:t>be addressed</w:t>
-      </w:r>
-      <w:proofErr w:type="gramEnd"/>
-      <w:r>
-        <w:t xml:space="preserve"> by the following achievable objectives: </w:t>
+        <w:t xml:space="preserve">The aim of this project will be addressed by the following achievable objectives: </w:t>
       </w:r>
     </w:p>
     <w:p>
@@ -2639,15 +2769,7 @@
         <w:t>customers,</w:t>
       </w:r>
       <w:r>
-        <w:t xml:space="preserve"> we could start </w:t>
-      </w:r>
-      <w:proofErr w:type="gramStart"/>
-      <w:r>
-        <w:t>working on training</w:t>
-      </w:r>
-      <w:proofErr w:type="gramEnd"/>
-      <w:r>
-        <w:t xml:space="preserve"> our machine learning model and implement a prototype.</w:t>
+        <w:t xml:space="preserve"> we could start working on training our machine learning model and implement a prototype.</w:t>
       </w:r>
     </w:p>
     <w:p>
@@ -2684,23 +2806,7 @@
         <w:t>with respect to</w:t>
       </w:r>
       <w:r>
-        <w:t xml:space="preserve"> the desired outcome. In other words, we should </w:t>
-      </w:r>
-      <w:proofErr w:type="gramStart"/>
-      <w:r>
-        <w:t>test</w:t>
-      </w:r>
-      <w:proofErr w:type="gramEnd"/>
-      <w:r>
-        <w:t xml:space="preserve"> the model and see if </w:t>
-      </w:r>
-      <w:proofErr w:type="gramStart"/>
-      <w:r>
-        <w:t>it’s</w:t>
-      </w:r>
-      <w:proofErr w:type="gramEnd"/>
-      <w:r>
-        <w:t xml:space="preserve"> working as desired.</w:t>
+        <w:t xml:space="preserve"> the desired outcome. In other words, we should test the model and see if it’s working as desired.</w:t>
       </w:r>
     </w:p>
     <w:p>
@@ -2719,7 +2825,7 @@
           <w:rFonts w:eastAsia="Aptos"/>
         </w:rPr>
       </w:pPr>
-      <w:bookmarkStart w:id="4" w:name="_Toc243404439"/>
+      <w:bookmarkStart w:id="4" w:name="_Toc243481751"/>
       <w:r>
         <w:rPr>
           <w:rFonts w:eastAsia="Aptos"/>
@@ -2761,21 +2867,11 @@
       <w:r>
         <w:t xml:space="preserve">by training it, </w:t>
       </w:r>
-      <w:proofErr w:type="gramStart"/>
       <w:r>
         <w:t>checking</w:t>
       </w:r>
-      <w:proofErr w:type="gramEnd"/>
-      <w:r>
-        <w:t xml:space="preserve"> and comparing predicted results (Accuracy, F1, Recall, Precision, </w:t>
-      </w:r>
-      <w:proofErr w:type="gramStart"/>
-      <w:r>
-        <w:t>etc.</w:t>
-      </w:r>
-      <w:proofErr w:type="gramEnd"/>
-      <w:r>
-        <w:t>), and making any relevant changes to its parameters to improve it. Once we finish with this, we will do a final test and send it to production.</w:t>
+      <w:r>
+        <w:t xml:space="preserve"> and comparing predicted results (Accuracy, F1, Recall, Precision, etc.), and making any relevant changes to its parameters to improve it. Once we finish with this, we will do a final test and send it to production.</w:t>
       </w:r>
     </w:p>
     <w:p/>
@@ -2797,7 +2893,7 @@
           <w:rFonts w:eastAsia="Aptos"/>
         </w:rPr>
       </w:pPr>
-      <w:bookmarkStart w:id="5" w:name="_Toc243404440"/>
+      <w:bookmarkStart w:id="5" w:name="_Toc243481752"/>
       <w:r>
         <w:rPr>
           <w:rFonts w:eastAsia="Aptos"/>
@@ -2915,11 +3011,9 @@
       <w:r>
         <w:t xml:space="preserve">, I propose to drop duplicate records, rename columns, </w:t>
       </w:r>
-      <w:proofErr w:type="spellStart"/>
-      <w:r>
-        <w:t>trem</w:t>
-      </w:r>
-      <w:proofErr w:type="spellEnd"/>
+      <w:r>
+        <w:t>trim</w:t>
+      </w:r>
       <w:r>
         <w:t xml:space="preserve"> and replace values if needed, and execute different encoding techniques depending on the column worked. For Example:</w:t>
       </w:r>
@@ -3014,15 +3108,7 @@
         <w:t>Encoder</w:t>
       </w:r>
       <w:r>
-        <w:t xml:space="preserve"> is most used for Boolean features that only have </w:t>
-      </w:r>
-      <w:proofErr w:type="gramStart"/>
-      <w:r>
-        <w:t>2</w:t>
-      </w:r>
-      <w:proofErr w:type="gramEnd"/>
-      <w:r>
-        <w:t xml:space="preserve"> unique values and retrieves only “0s” and “1s”. About </w:t>
+        <w:t xml:space="preserve"> is most used for Boolean features that only have 2 unique values and retrieves only “0s” and “1s”. About </w:t>
       </w:r>
       <w:r>
         <w:rPr>
@@ -3073,31 +3159,7 @@
         <w:t>used</w:t>
       </w:r>
       <w:r>
-        <w:t xml:space="preserve"> to prevent the model from assuming any type of mathematical hierarchy or distance between categories (e.g., there is no relevant difference between “Cat</w:t>
-      </w:r>
-      <w:proofErr w:type="gramStart"/>
-      <w:r>
-        <w:t>”,</w:t>
-      </w:r>
-      <w:proofErr w:type="gramEnd"/>
-      <w:r>
-        <w:t xml:space="preserve"> “Dog</w:t>
-      </w:r>
-      <w:proofErr w:type="gramStart"/>
-      <w:r>
-        <w:t>”,</w:t>
-      </w:r>
-      <w:proofErr w:type="gramEnd"/>
-      <w:r>
-        <w:t xml:space="preserve"> and “Lamb</w:t>
-      </w:r>
-      <w:proofErr w:type="gramStart"/>
-      <w:r>
-        <w:t>”,</w:t>
-      </w:r>
-      <w:proofErr w:type="gramEnd"/>
-      <w:r>
-        <w:t xml:space="preserve"> but if our model read “1”,”2”, and ”3” it could think that the number 3 has some higher importance than 1 and 2, which is not the case). Finally, for </w:t>
+        <w:t xml:space="preserve"> to prevent the model from assuming any type of mathematical hierarchy or distance between categories (e.g., there is no relevant difference between “Cat”, “Dog”, and “Lamb”, but if our model read “1”,”2”, and ”3” it could think that the number 3 has some higher importance than 1 and 2, which is not the case). Finally, for </w:t>
       </w:r>
       <w:r>
         <w:rPr>
@@ -3107,23 +3169,7 @@
         <w:t>mapping</w:t>
       </w:r>
       <w:r>
-        <w:t>, I will use it to set Ordinal Variables Accordingly, making sure that the order between the values is correct (e.g., a feature containing the values “Employee</w:t>
-      </w:r>
-      <w:proofErr w:type="gramStart"/>
-      <w:r>
-        <w:t>”,</w:t>
-      </w:r>
-      <w:proofErr w:type="gramEnd"/>
-      <w:r>
-        <w:t xml:space="preserve"> “Team leader</w:t>
-      </w:r>
-      <w:proofErr w:type="gramStart"/>
-      <w:r>
-        <w:t>”,</w:t>
-      </w:r>
-      <w:proofErr w:type="gramEnd"/>
-      <w:r>
-        <w:t xml:space="preserve"> “Manager” and “Region Manager”).</w:t>
+        <w:t>, I will use it to set Ordinal Variables Accordingly, making sure that the order between the values is correct (e.g., a feature containing the values “Employee”, “Team leader”, “Manager” and “Region Manager”).</w:t>
       </w:r>
     </w:p>
     <w:p>
@@ -3232,7 +3278,6 @@
         <w:t>GXBoost</w:t>
       </w:r>
       <w:proofErr w:type="spellEnd"/>
-      <w:proofErr w:type="gramStart"/>
       <w:r>
         <w:t>.</w:t>
       </w:r>
@@ -3244,26 +3289,17 @@
         <w:t xml:space="preserve"> </w:t>
       </w:r>
       <w:r>
-        <w:t xml:space="preserve"> </w:t>
-      </w:r>
-      <w:proofErr w:type="gramEnd"/>
-      <w:r>
-        <w:t>S</w:t>
+        <w:t xml:space="preserve"> S</w:t>
       </w:r>
       <w:r>
         <w:t>ince</w:t>
       </w:r>
       <w:r>
-        <w:t xml:space="preserve"> we will be able to identify what type of characteristics the user like within a song (e.g., BPM, Danceability, Energy, </w:t>
-      </w:r>
-      <w:proofErr w:type="gramStart"/>
-      <w:r>
-        <w:t>Etc</w:t>
+        <w:t xml:space="preserve"> we will be able to identify what type of characteristics the user like within a song (e.g., BPM, Danceability, Energy, Etc</w:t>
       </w:r>
       <w:r>
         <w:t>.</w:t>
       </w:r>
-      <w:proofErr w:type="gramEnd"/>
       <w:r>
         <w:t>)</w:t>
       </w:r>
@@ -3359,7 +3395,7 @@
           <w:rFonts w:eastAsia="Aptos"/>
         </w:rPr>
       </w:pPr>
-      <w:bookmarkStart w:id="6" w:name="_Toc243404441"/>
+      <w:bookmarkStart w:id="6" w:name="_Toc243481753"/>
       <w:r>
         <w:rPr>
           <w:rFonts w:eastAsia="Aptos"/>
@@ -3370,29 +3406,27 @@
     </w:p>
     <w:p>
       <w:r>
-        <w:t xml:space="preserve">In my research for different data sources for this project, I have found </w:t>
+        <w:t xml:space="preserve">In my research for different data sources for this project, I have found some </w:t>
       </w:r>
       <w:proofErr w:type="gramStart"/>
       <w:r>
-        <w:t>some</w:t>
+        <w:t>really interesting</w:t>
       </w:r>
       <w:proofErr w:type="gramEnd"/>
       <w:r>
-        <w:t xml:space="preserve"> </w:t>
-      </w:r>
-      <w:proofErr w:type="gramStart"/>
-      <w:r>
-        <w:t>really interesting</w:t>
-      </w:r>
-      <w:proofErr w:type="gramEnd"/>
-      <w:r>
-        <w:t xml:space="preserve"> options; I will list bellow using bullet points and mentioning the origin of </w:t>
-      </w:r>
-      <w:r>
-        <w:t>them</w:t>
-      </w:r>
-      <w:r>
-        <w:t>.</w:t>
+        <w:t xml:space="preserve"> options; I will list </w:t>
+      </w:r>
+      <w:r>
+        <w:t>them below</w:t>
+      </w:r>
+      <w:r>
+        <w:t xml:space="preserve"> using bullet points and mentioning </w:t>
+      </w:r>
+      <w:r>
+        <w:t>their</w:t>
+      </w:r>
+      <w:r>
+        <w:t xml:space="preserve"> origin.</w:t>
       </w:r>
     </w:p>
     <w:p>
@@ -3412,14 +3446,7 @@
           <w:i/>
           <w:iCs/>
         </w:rPr>
-        <w:t xml:space="preserve">Kaggle: </w:t>
-      </w:r>
-      <w:r>
-        <w:rPr>
-          <w:i/>
-          <w:iCs/>
-        </w:rPr>
-        <w:t> </w:t>
+        <w:t>Kaggle:  </w:t>
       </w:r>
       <w:hyperlink r:id="rId16" w:history="1">
         <w:r>
@@ -3438,21 +3465,14 @@
         </w:rPr>
         <w:t xml:space="preserve">. </w:t>
       </w:r>
-      <w:proofErr w:type="gramStart"/>
-      <w:r>
-        <w:t>It’s</w:t>
-      </w:r>
-      <w:proofErr w:type="gramEnd"/>
-      <w:r>
-        <w:t xml:space="preserve"> a CSV file that contains over 20.000 records featuring song metadata, such as energy, danceability, loudness, and duration. The dataset </w:t>
-      </w:r>
-      <w:proofErr w:type="gramStart"/>
-      <w:r>
-        <w:t>is licensed</w:t>
-      </w:r>
-      <w:proofErr w:type="gramEnd"/>
-      <w:r>
-        <w:t xml:space="preserve"> under the </w:t>
+      <w:r>
+        <w:t xml:space="preserve">It’s a CSV file </w:t>
+      </w:r>
+      <w:r>
+        <w:t>with over 20,000 records of</w:t>
+      </w:r>
+      <w:r>
+        <w:t xml:space="preserve"> song metadata, such as energy, danceability, loudness, and duration. The dataset is licensed under the </w:t>
       </w:r>
       <w:hyperlink r:id="rId17" w:history="1">
         <w:r>
@@ -3500,87 +3520,42 @@
           <w:i/>
           <w:iCs/>
         </w:rPr>
-        <w:t xml:space="preserve">. </w:t>
-      </w:r>
-      <w:proofErr w:type="gramStart"/>
+        <w:t xml:space="preserve">. It’s also a CSV file with nearly 600.000 records featuring song metadata. The dataset is licensed under the Community Data License Agreement – Sharing, Version 1.0, </w:t>
+      </w:r>
       <w:r>
         <w:rPr>
           <w:i/>
           <w:iCs/>
         </w:rPr>
-        <w:t>It’s</w:t>
-      </w:r>
-      <w:proofErr w:type="gramEnd"/>
+        <w:t>meaning it’s copyright-free and</w:t>
+      </w:r>
       <w:r>
         <w:rPr>
           <w:i/>
           <w:iCs/>
         </w:rPr>
-        <w:t xml:space="preserve"> also a CSV file with </w:t>
-      </w:r>
-      <w:proofErr w:type="gramStart"/>
-      <w:r>
-        <w:rPr>
-          <w:i/>
-          <w:iCs/>
-        </w:rPr>
-        <w:t>nearly 600.000</w:t>
-      </w:r>
-      <w:proofErr w:type="gramEnd"/>
-      <w:r>
-        <w:rPr>
-          <w:i/>
-          <w:iCs/>
-        </w:rPr>
-        <w:t xml:space="preserve"> records featuring song metadata. The dataset </w:t>
-      </w:r>
-      <w:proofErr w:type="gramStart"/>
-      <w:r>
-        <w:rPr>
-          <w:i/>
-          <w:iCs/>
-        </w:rPr>
-        <w:t>is licensed</w:t>
-      </w:r>
-      <w:proofErr w:type="gramEnd"/>
-      <w:r>
-        <w:rPr>
-          <w:i/>
-          <w:iCs/>
-        </w:rPr>
-        <w:t xml:space="preserve"> under the Community Data License Agreement – </w:t>
-      </w:r>
-      <w:proofErr w:type="gramStart"/>
-      <w:r>
-        <w:rPr>
-          <w:i/>
-          <w:iCs/>
-        </w:rPr>
-        <w:t>Sharing ,</w:t>
-      </w:r>
-      <w:proofErr w:type="gramEnd"/>
-      <w:r>
-        <w:rPr>
-          <w:i/>
-          <w:iCs/>
-        </w:rPr>
-        <w:t xml:space="preserve"> Version 1.0, Meaning that </w:t>
-      </w:r>
-      <w:proofErr w:type="gramStart"/>
-      <w:r>
-        <w:rPr>
-          <w:i/>
-          <w:iCs/>
-        </w:rPr>
-        <w:t>It’s</w:t>
-      </w:r>
-      <w:proofErr w:type="gramEnd"/>
-      <w:r>
-        <w:rPr>
-          <w:i/>
-          <w:iCs/>
-        </w:rPr>
-        <w:t xml:space="preserve"> copyright-free, I can use it for my project and to train my machine learning models.</w:t>
+        <w:t xml:space="preserve"> I can use it for my project and to train my machine learning models.</w:t>
+      </w:r>
+    </w:p>
+    <w:p>
+      <w:pPr>
+        <w:pStyle w:val="Heading2"/>
+        <w:rPr>
+          <w:rFonts w:eastAsia="Aptos"/>
+        </w:rPr>
+      </w:pPr>
+      <w:bookmarkStart w:id="7" w:name="_Toc243481754"/>
+      <w:r>
+        <w:rPr>
+          <w:rFonts w:eastAsia="Aptos"/>
+        </w:rPr>
+        <w:t>Expected Deliverables</w:t>
+      </w:r>
+      <w:bookmarkEnd w:id="7"/>
+    </w:p>
+    <w:p>
+      <w:r>
+        <w:t>I can split the expected deliverables into 3 different sections:</w:t>
       </w:r>
     </w:p>
     <w:p>
@@ -3588,53 +3563,233 @@
         <w:pStyle w:val="ListParagraph"/>
         <w:numPr>
           <w:ilvl w:val="0"/>
-          <w:numId w:val="12"/>
+          <w:numId w:val="21"/>
         </w:numPr>
         <w:rPr>
-          <w:i/>
-          <w:iCs/>
-        </w:rPr>
-      </w:pPr>
-      <w:r>
-        <w:rPr>
-          <w:i/>
-          <w:iCs/>
-        </w:rPr>
-        <w:t xml:space="preserve">Kaggle: </w:t>
-      </w:r>
-      <w:hyperlink r:id="rId19" w:history="1">
-        <w:r>
-          <w:rPr>
-            <w:rStyle w:val="Hyperlink"/>
-            <w:i/>
-            <w:iCs/>
-          </w:rPr>
-          <w:t>Dataset 3</w:t>
-        </w:r>
-      </w:hyperlink>
-      <w:r>
-        <w:rPr>
-          <w:i/>
-          <w:iCs/>
-        </w:rPr>
-        <w:t xml:space="preserve">. </w:t>
+          <w:b/>
+          <w:bCs/>
+        </w:rPr>
+      </w:pPr>
+      <w:r>
+        <w:rPr>
+          <w:b/>
+          <w:bCs/>
+        </w:rPr>
+        <w:t>Analytical Results</w:t>
+      </w:r>
+      <w:r>
+        <w:rPr>
+          <w:b/>
+          <w:bCs/>
+        </w:rPr>
+        <w:t>:</w:t>
+      </w:r>
+      <w:r>
+        <w:t xml:space="preserve"> By the end of semester 2, I should have cleaned our data, </w:t>
+      </w:r>
+      <w:r>
+        <w:t>conducted an Exploratory Data Analysis, looked for insights and potentially found patterns using pivot tables, charts, correlation plots, and distributions.</w:t>
       </w:r>
     </w:p>
-    <w:p/>
-    <w:p/>
-    <w:p/>
-    <w:p/>
-    <w:p/>
-    <w:p/>
     <w:p>
       <w:pPr>
+        <w:pStyle w:val="ListParagraph"/>
+        <w:numPr>
+          <w:ilvl w:val="0"/>
+          <w:numId w:val="21"/>
+        </w:numPr>
+        <w:rPr>
+          <w:b/>
+          <w:bCs/>
+        </w:rPr>
+      </w:pPr>
+      <w:r>
+        <w:rPr>
+          <w:b/>
+          <w:bCs/>
+        </w:rPr>
+        <w:t xml:space="preserve">Predictive Modelling Outputs: </w:t>
+      </w:r>
+      <w:r>
+        <w:t>With our data cleaned, we should be ready to execute encoding as specified above with the mentioned techniques (</w:t>
+      </w:r>
+      <w:r>
+        <w:rPr>
+          <w:b/>
+          <w:bCs/>
+        </w:rPr>
+        <w:t>Label Encoder</w:t>
+      </w:r>
+      <w:r>
+        <w:t xml:space="preserve">, </w:t>
+      </w:r>
+      <w:r>
+        <w:rPr>
+          <w:b/>
+          <w:bCs/>
+        </w:rPr>
+        <w:t>Mapping, and One Hot Encoder</w:t>
+      </w:r>
+      <w:r>
+        <w:t>)</w:t>
+      </w:r>
+      <w:r>
+        <w:rPr>
+          <w:b/>
+          <w:bCs/>
+        </w:rPr>
+        <w:t xml:space="preserve">; </w:t>
+      </w:r>
+      <w:r>
+        <w:t>for further training, testing and evaluation of our models, comparing the results obtained on Accuracy, Recall, Precision, and F1.</w:t>
+      </w:r>
+    </w:p>
+    <w:p>
+      <w:pPr>
+        <w:pStyle w:val="ListParagraph"/>
+        <w:numPr>
+          <w:ilvl w:val="0"/>
+          <w:numId w:val="21"/>
+        </w:numPr>
+        <w:rPr>
+          <w:b/>
+          <w:bCs/>
+        </w:rPr>
+      </w:pPr>
+      <w:r>
+        <w:rPr>
+          <w:b/>
+          <w:bCs/>
+        </w:rPr>
+        <w:t>Final R</w:t>
+      </w:r>
+      <w:r>
+        <w:rPr>
+          <w:b/>
+          <w:bCs/>
+        </w:rPr>
+        <w:t>eport:</w:t>
+      </w:r>
+      <w:r>
+        <w:t xml:space="preserve"> A well-detailed report explaining step-by-step how we handle the data, the methods used, the challenges during the process and the results obtained from the machine learning models. </w:t>
+      </w:r>
+    </w:p>
+    <w:p>
+      <w:pPr>
+        <w:pStyle w:val="Heading2"/>
+        <w:rPr>
+          <w:rFonts w:eastAsia="Aptos"/>
+        </w:rPr>
+      </w:pPr>
+      <w:bookmarkStart w:id="8" w:name="_Toc243481755"/>
+      <w:r>
+        <w:rPr>
+          <w:rFonts w:eastAsia="Aptos"/>
+        </w:rPr>
+        <w:t>Project Timeline</w:t>
+      </w:r>
+      <w:bookmarkEnd w:id="8"/>
+    </w:p>
+    <w:p>
+      <w:pPr>
+        <w:rPr>
+          <w:noProof/>
+        </w:rPr>
+      </w:pPr>
+    </w:p>
+    <w:p>
+      <w:r>
+        <w:rPr>
+          <w:noProof/>
+        </w:rPr>
+        <w:drawing>
+          <wp:inline distT="0" distB="0" distL="0" distR="0" wp14:anchorId="4BBE520C" wp14:editId="2EB47069">
+            <wp:extent cx="5172501" cy="3085965"/>
+            <wp:effectExtent l="0" t="0" r="0" b="635"/>
+            <wp:docPr id="231265528" name="Picture 5"/>
+            <wp:cNvGraphicFramePr>
+              <a:graphicFrameLocks xmlns:a="http://schemas.openxmlformats.org/drawingml/2006/main" noChangeAspect="1"/>
+            </wp:cNvGraphicFramePr>
+            <a:graphic xmlns:a="http://schemas.openxmlformats.org/drawingml/2006/main">
+              <a:graphicData uri="http://schemas.openxmlformats.org/drawingml/2006/picture">
+                <pic:pic xmlns:pic="http://schemas.openxmlformats.org/drawingml/2006/picture">
+                  <pic:nvPicPr>
+                    <pic:cNvPr id="231265528" name="Picture 231265528"/>
+                    <pic:cNvPicPr/>
+                  </pic:nvPicPr>
+                  <pic:blipFill rotWithShape="1">
+                    <a:blip r:embed="rId19">
+                      <a:extLst>
+                        <a:ext uri="{28A0092B-C50C-407E-A947-70E740481C1C}">
+                          <a14:useLocalDpi xmlns:a14="http://schemas.microsoft.com/office/drawing/2010/main" val="0"/>
+                        </a:ext>
+                      </a:extLst>
+                    </a:blip>
+                    <a:srcRect b="20446"/>
+                    <a:stretch>
+                      <a:fillRect/>
+                    </a:stretch>
+                  </pic:blipFill>
+                  <pic:spPr bwMode="auto">
+                    <a:xfrm>
+                      <a:off x="0" y="0"/>
+                      <a:ext cx="5175448" cy="3087723"/>
+                    </a:xfrm>
+                    <a:prstGeom prst="rect">
+                      <a:avLst/>
+                    </a:prstGeom>
+                    <a:ln>
+                      <a:noFill/>
+                    </a:ln>
+                    <a:extLst>
+                      <a:ext uri="{53640926-AAD7-44D8-BBD7-CCE9431645EC}">
+                        <a14:shadowObscured xmlns:a14="http://schemas.microsoft.com/office/drawing/2010/main"/>
+                      </a:ext>
+                    </a:extLst>
+                  </pic:spPr>
+                </pic:pic>
+              </a:graphicData>
+            </a:graphic>
+          </wp:inline>
+        </w:drawing>
+      </w:r>
+    </w:p>
+    <w:p>
+      <w:pPr>
+        <w:pStyle w:val="Heading2"/>
+        <w:rPr>
+          <w:rFonts w:eastAsia="Aptos"/>
+        </w:rPr>
+      </w:pPr>
+      <w:bookmarkStart w:id="9" w:name="_Toc243481756"/>
+      <w:r>
+        <w:rPr>
+          <w:rFonts w:eastAsia="Aptos"/>
+        </w:rPr>
+        <w:lastRenderedPageBreak/>
+        <w:t>Ethical and Legal Considerations</w:t>
+      </w:r>
+      <w:bookmarkEnd w:id="9"/>
+    </w:p>
+    <w:p>
+      <w:pPr>
         <w:pStyle w:val="Heading1"/>
       </w:pPr>
-      <w:bookmarkStart w:id="7" w:name="_Toc243404442"/>
+    </w:p>
+    <w:p>
+      <w:pPr>
+        <w:pStyle w:val="Heading1"/>
+      </w:pPr>
+    </w:p>
+    <w:p>
+      <w:pPr>
+        <w:pStyle w:val="Heading1"/>
+      </w:pPr>
+      <w:bookmarkStart w:id="10" w:name="_Toc243481757"/>
       <w:r>
         <w:t>References</w:t>
       </w:r>
-      <w:bookmarkEnd w:id="7"/>
+      <w:bookmarkEnd w:id="10"/>
     </w:p>
     <w:p/>
     <w:p>
@@ -3647,16 +3802,8 @@
         <w:rPr>
           <w:color w:val="FF0000"/>
         </w:rPr>
-        <w:t xml:space="preserve">Please list all the references you have used in your assignment alphabetically and in the Harvard style. You can find information on how to correctly reference in Harvard at this link: </w:t>
-      </w:r>
-      <w:proofErr w:type="gramStart"/>
-      <w:r>
-        <w:rPr>
-          <w:color w:val="FF0000"/>
-        </w:rPr>
-        <w:t>https://library.cct.ie/referencing/harvard</w:t>
-      </w:r>
-      <w:proofErr w:type="gramEnd"/>
+        <w:t>Please list all the references you have used in your assignment alphabetically and in the Harvard style. You can find information on how to correctly reference in Harvard at this link: https://library.cct.ie/referencing/harvard</w:t>
+      </w:r>
     </w:p>
     <w:p/>
     <w:p/>
@@ -3704,13 +3851,13 @@
       <w:pPr>
         <w:pStyle w:val="Heading1"/>
       </w:pPr>
-      <w:bookmarkStart w:id="8" w:name="_heading=h.kfkjs3rwl2c1" w:colFirst="0" w:colLast="0"/>
-      <w:bookmarkStart w:id="9" w:name="_Toc243404443"/>
-      <w:bookmarkEnd w:id="8"/>
+      <w:bookmarkStart w:id="11" w:name="_heading=h.kfkjs3rwl2c1" w:colFirst="0" w:colLast="0"/>
+      <w:bookmarkStart w:id="12" w:name="_Toc243481758"/>
+      <w:bookmarkEnd w:id="11"/>
       <w:r>
         <w:t>Appendix</w:t>
       </w:r>
-      <w:bookmarkEnd w:id="9"/>
+      <w:bookmarkEnd w:id="12"/>
     </w:p>
     <w:p/>
     <w:p>
@@ -3743,21 +3890,7 @@
         <w:rPr>
           <w:color w:val="FF0000"/>
         </w:rPr>
-        <w:t xml:space="preserve">The appendix serves as a repository for additional or supplementary information that </w:t>
-      </w:r>
-      <w:proofErr w:type="gramStart"/>
-      <w:r>
-        <w:rPr>
-          <w:color w:val="FF0000"/>
-        </w:rPr>
-        <w:t>is deemed</w:t>
-      </w:r>
-      <w:proofErr w:type="gramEnd"/>
-      <w:r>
-        <w:rPr>
-          <w:color w:val="FF0000"/>
-        </w:rPr>
-        <w:t xml:space="preserve"> too extensive or detailed for integration into the main body of the text. This supplementary content can encompass data tables, charts, graphs, questionnaires, or any other supporting materials that contribute to a comprehensive understanding of the research.</w:t>
+        <w:t>The appendix serves as a repository for additional or supplementary information that is deemed too extensive or detailed for integration into the main body of the text. This supplementary content can encompass data tables, charts, graphs, questionnaires, or any other supporting materials that contribute to a comprehensive understanding of the research.</w:t>
       </w:r>
     </w:p>
     <w:p>
@@ -3770,35 +3903,7 @@
         <w:rPr>
           <w:color w:val="FF0000"/>
         </w:rPr>
-        <w:t xml:space="preserve">If you </w:t>
-      </w:r>
-      <w:proofErr w:type="gramStart"/>
-      <w:r>
-        <w:rPr>
-          <w:color w:val="FF0000"/>
-        </w:rPr>
-        <w:t>haven't</w:t>
-      </w:r>
-      <w:proofErr w:type="gramEnd"/>
-      <w:r>
-        <w:rPr>
-          <w:color w:val="FF0000"/>
-        </w:rPr>
-        <w:t xml:space="preserve"> used AI tools and </w:t>
-      </w:r>
-      <w:proofErr w:type="gramStart"/>
-      <w:r>
-        <w:rPr>
-          <w:color w:val="FF0000"/>
-        </w:rPr>
-        <w:t>there's</w:t>
-      </w:r>
-      <w:proofErr w:type="gramEnd"/>
-      <w:r>
-        <w:rPr>
-          <w:color w:val="FF0000"/>
-        </w:rPr>
-        <w:t xml:space="preserve"> no need for supplementary data, you can remove the appendix section entirely.</w:t>
+        <w:t>If you haven't used AI tools and there's no need for supplementary data, you can remove the appendix section entirely.</w:t>
       </w:r>
     </w:p>
     <w:p>
@@ -4962,6 +5067,96 @@
     </w:lvl>
   </w:abstractNum>
   <w:abstractNum w:abstractNumId="9" w15:restartNumberingAfterBreak="0">
+    <w:nsid w:val="463360E0"/>
+    <w:multiLevelType w:val="hybridMultilevel"/>
+    <w:tmpl w:val="0082C580"/>
+    <w:lvl w:ilvl="0" w:tplc="037E71CC">
+      <w:start w:val="1"/>
+      <w:numFmt w:val="decimal"/>
+      <w:lvlText w:val="%1."/>
+      <w:lvlJc w:val="left"/>
+      <w:pPr>
+        <w:ind w:left="720" w:hanging="360"/>
+      </w:pPr>
+      <w:rPr>
+        <w:rFonts w:hint="default"/>
+        <w:b/>
+      </w:rPr>
+    </w:lvl>
+    <w:lvl w:ilvl="1" w:tplc="18090019" w:tentative="1">
+      <w:start w:val="1"/>
+      <w:numFmt w:val="lowerLetter"/>
+      <w:lvlText w:val="%2."/>
+      <w:lvlJc w:val="left"/>
+      <w:pPr>
+        <w:ind w:left="1440" w:hanging="360"/>
+      </w:pPr>
+    </w:lvl>
+    <w:lvl w:ilvl="2" w:tplc="1809001B" w:tentative="1">
+      <w:start w:val="1"/>
+      <w:numFmt w:val="lowerRoman"/>
+      <w:lvlText w:val="%3."/>
+      <w:lvlJc w:val="right"/>
+      <w:pPr>
+        <w:ind w:left="2160" w:hanging="180"/>
+      </w:pPr>
+    </w:lvl>
+    <w:lvl w:ilvl="3" w:tplc="1809000F" w:tentative="1">
+      <w:start w:val="1"/>
+      <w:numFmt w:val="decimal"/>
+      <w:lvlText w:val="%4."/>
+      <w:lvlJc w:val="left"/>
+      <w:pPr>
+        <w:ind w:left="2880" w:hanging="360"/>
+      </w:pPr>
+    </w:lvl>
+    <w:lvl w:ilvl="4" w:tplc="18090019" w:tentative="1">
+      <w:start w:val="1"/>
+      <w:numFmt w:val="lowerLetter"/>
+      <w:lvlText w:val="%5."/>
+      <w:lvlJc w:val="left"/>
+      <w:pPr>
+        <w:ind w:left="3600" w:hanging="360"/>
+      </w:pPr>
+    </w:lvl>
+    <w:lvl w:ilvl="5" w:tplc="1809001B" w:tentative="1">
+      <w:start w:val="1"/>
+      <w:numFmt w:val="lowerRoman"/>
+      <w:lvlText w:val="%6."/>
+      <w:lvlJc w:val="right"/>
+      <w:pPr>
+        <w:ind w:left="4320" w:hanging="180"/>
+      </w:pPr>
+    </w:lvl>
+    <w:lvl w:ilvl="6" w:tplc="1809000F" w:tentative="1">
+      <w:start w:val="1"/>
+      <w:numFmt w:val="decimal"/>
+      <w:lvlText w:val="%7."/>
+      <w:lvlJc w:val="left"/>
+      <w:pPr>
+        <w:ind w:left="5040" w:hanging="360"/>
+      </w:pPr>
+    </w:lvl>
+    <w:lvl w:ilvl="7" w:tplc="18090019" w:tentative="1">
+      <w:start w:val="1"/>
+      <w:numFmt w:val="lowerLetter"/>
+      <w:lvlText w:val="%8."/>
+      <w:lvlJc w:val="left"/>
+      <w:pPr>
+        <w:ind w:left="5760" w:hanging="360"/>
+      </w:pPr>
+    </w:lvl>
+    <w:lvl w:ilvl="8" w:tplc="1809001B" w:tentative="1">
+      <w:start w:val="1"/>
+      <w:numFmt w:val="lowerRoman"/>
+      <w:lvlText w:val="%9."/>
+      <w:lvlJc w:val="right"/>
+      <w:pPr>
+        <w:ind w:left="6480" w:hanging="180"/>
+      </w:pPr>
+    </w:lvl>
+  </w:abstractNum>
+  <w:abstractNum w:abstractNumId="10" w15:restartNumberingAfterBreak="0">
     <w:nsid w:val="4AC07638"/>
     <w:multiLevelType w:val="hybridMultilevel"/>
     <w:tmpl w:val="83CA4F22"/>
@@ -5050,7 +5245,7 @@
       </w:pPr>
     </w:lvl>
   </w:abstractNum>
-  <w:abstractNum w:abstractNumId="10" w15:restartNumberingAfterBreak="0">
+  <w:abstractNum w:abstractNumId="11" w15:restartNumberingAfterBreak="0">
     <w:nsid w:val="56C20A0A"/>
     <w:multiLevelType w:val="hybridMultilevel"/>
     <w:tmpl w:val="D2CC7556"/>
@@ -5139,7 +5334,7 @@
       </w:pPr>
     </w:lvl>
   </w:abstractNum>
-  <w:abstractNum w:abstractNumId="11" w15:restartNumberingAfterBreak="0">
+  <w:abstractNum w:abstractNumId="12" w15:restartNumberingAfterBreak="0">
     <w:nsid w:val="574E0B09"/>
     <w:multiLevelType w:val="hybridMultilevel"/>
     <w:tmpl w:val="C094A4D8"/>
@@ -5228,7 +5423,7 @@
       </w:pPr>
     </w:lvl>
   </w:abstractNum>
-  <w:abstractNum w:abstractNumId="12" w15:restartNumberingAfterBreak="0">
+  <w:abstractNum w:abstractNumId="13" w15:restartNumberingAfterBreak="0">
     <w:nsid w:val="5C2530F8"/>
     <w:multiLevelType w:val="hybridMultilevel"/>
     <w:tmpl w:val="CE54F052"/>
@@ -5317,7 +5512,7 @@
       </w:pPr>
     </w:lvl>
   </w:abstractNum>
-  <w:abstractNum w:abstractNumId="13" w15:restartNumberingAfterBreak="0">
+  <w:abstractNum w:abstractNumId="14" w15:restartNumberingAfterBreak="0">
     <w:nsid w:val="5F1450D7"/>
     <w:multiLevelType w:val="hybridMultilevel"/>
     <w:tmpl w:val="9A2C1BE8"/>
@@ -5406,7 +5601,96 @@
       </w:pPr>
     </w:lvl>
   </w:abstractNum>
-  <w:abstractNum w:abstractNumId="14" w15:restartNumberingAfterBreak="0">
+  <w:abstractNum w:abstractNumId="15" w15:restartNumberingAfterBreak="0">
+    <w:nsid w:val="60FE39E3"/>
+    <w:multiLevelType w:val="hybridMultilevel"/>
+    <w:tmpl w:val="D0D2AC9A"/>
+    <w:lvl w:ilvl="0" w:tplc="1809000F">
+      <w:start w:val="1"/>
+      <w:numFmt w:val="decimal"/>
+      <w:lvlText w:val="%1."/>
+      <w:lvlJc w:val="left"/>
+      <w:pPr>
+        <w:ind w:left="720" w:hanging="360"/>
+      </w:pPr>
+      <w:rPr>
+        <w:rFonts w:hint="default"/>
+      </w:rPr>
+    </w:lvl>
+    <w:lvl w:ilvl="1" w:tplc="18090019" w:tentative="1">
+      <w:start w:val="1"/>
+      <w:numFmt w:val="lowerLetter"/>
+      <w:lvlText w:val="%2."/>
+      <w:lvlJc w:val="left"/>
+      <w:pPr>
+        <w:ind w:left="1440" w:hanging="360"/>
+      </w:pPr>
+    </w:lvl>
+    <w:lvl w:ilvl="2" w:tplc="1809001B" w:tentative="1">
+      <w:start w:val="1"/>
+      <w:numFmt w:val="lowerRoman"/>
+      <w:lvlText w:val="%3."/>
+      <w:lvlJc w:val="right"/>
+      <w:pPr>
+        <w:ind w:left="2160" w:hanging="180"/>
+      </w:pPr>
+    </w:lvl>
+    <w:lvl w:ilvl="3" w:tplc="1809000F" w:tentative="1">
+      <w:start w:val="1"/>
+      <w:numFmt w:val="decimal"/>
+      <w:lvlText w:val="%4."/>
+      <w:lvlJc w:val="left"/>
+      <w:pPr>
+        <w:ind w:left="2880" w:hanging="360"/>
+      </w:pPr>
+    </w:lvl>
+    <w:lvl w:ilvl="4" w:tplc="18090019" w:tentative="1">
+      <w:start w:val="1"/>
+      <w:numFmt w:val="lowerLetter"/>
+      <w:lvlText w:val="%5."/>
+      <w:lvlJc w:val="left"/>
+      <w:pPr>
+        <w:ind w:left="3600" w:hanging="360"/>
+      </w:pPr>
+    </w:lvl>
+    <w:lvl w:ilvl="5" w:tplc="1809001B" w:tentative="1">
+      <w:start w:val="1"/>
+      <w:numFmt w:val="lowerRoman"/>
+      <w:lvlText w:val="%6."/>
+      <w:lvlJc w:val="right"/>
+      <w:pPr>
+        <w:ind w:left="4320" w:hanging="180"/>
+      </w:pPr>
+    </w:lvl>
+    <w:lvl w:ilvl="6" w:tplc="1809000F" w:tentative="1">
+      <w:start w:val="1"/>
+      <w:numFmt w:val="decimal"/>
+      <w:lvlText w:val="%7."/>
+      <w:lvlJc w:val="left"/>
+      <w:pPr>
+        <w:ind w:left="5040" w:hanging="360"/>
+      </w:pPr>
+    </w:lvl>
+    <w:lvl w:ilvl="7" w:tplc="18090019" w:tentative="1">
+      <w:start w:val="1"/>
+      <w:numFmt w:val="lowerLetter"/>
+      <w:lvlText w:val="%8."/>
+      <w:lvlJc w:val="left"/>
+      <w:pPr>
+        <w:ind w:left="5760" w:hanging="360"/>
+      </w:pPr>
+    </w:lvl>
+    <w:lvl w:ilvl="8" w:tplc="1809001B" w:tentative="1">
+      <w:start w:val="1"/>
+      <w:numFmt w:val="lowerRoman"/>
+      <w:lvlText w:val="%9."/>
+      <w:lvlJc w:val="right"/>
+      <w:pPr>
+        <w:ind w:left="6480" w:hanging="180"/>
+      </w:pPr>
+    </w:lvl>
+  </w:abstractNum>
+  <w:abstractNum w:abstractNumId="16" w15:restartNumberingAfterBreak="0">
     <w:nsid w:val="675573C9"/>
     <w:multiLevelType w:val="multilevel"/>
     <w:tmpl w:val="57D27894"/>
@@ -5555,7 +5839,7 @@
       </w:rPr>
     </w:lvl>
   </w:abstractNum>
-  <w:abstractNum w:abstractNumId="15" w15:restartNumberingAfterBreak="0">
+  <w:abstractNum w:abstractNumId="17" w15:restartNumberingAfterBreak="0">
     <w:nsid w:val="74B043EF"/>
     <w:multiLevelType w:val="hybridMultilevel"/>
     <w:tmpl w:val="F9444584"/>
@@ -5644,7 +5928,7 @@
       </w:pPr>
     </w:lvl>
   </w:abstractNum>
-  <w:abstractNum w:abstractNumId="16" w15:restartNumberingAfterBreak="0">
+  <w:abstractNum w:abstractNumId="18" w15:restartNumberingAfterBreak="0">
     <w:nsid w:val="7A490A53"/>
     <w:multiLevelType w:val="multilevel"/>
     <w:tmpl w:val="9EA23756"/>
@@ -5793,7 +6077,7 @@
       </w:rPr>
     </w:lvl>
   </w:abstractNum>
-  <w:abstractNum w:abstractNumId="17" w15:restartNumberingAfterBreak="0">
+  <w:abstractNum w:abstractNumId="19" w15:restartNumberingAfterBreak="0">
     <w:nsid w:val="7BAB1799"/>
     <w:multiLevelType w:val="hybridMultilevel"/>
     <w:tmpl w:val="B16024B6"/>
@@ -5906,7 +6190,7 @@
       </w:rPr>
     </w:lvl>
   </w:abstractNum>
-  <w:abstractNum w:abstractNumId="18" w15:restartNumberingAfterBreak="0">
+  <w:abstractNum w:abstractNumId="20" w15:restartNumberingAfterBreak="0">
     <w:nsid w:val="7BDD163A"/>
     <w:multiLevelType w:val="hybridMultilevel"/>
     <w:tmpl w:val="EB1AC64E"/>
@@ -6002,13 +6286,13 @@
     <w:abstractNumId w:val="1"/>
   </w:num>
   <w:num w:numId="3" w16cid:durableId="728696014">
-    <w:abstractNumId w:val="14"/>
+    <w:abstractNumId w:val="16"/>
   </w:num>
   <w:num w:numId="4" w16cid:durableId="1057824889">
     <w:abstractNumId w:val="0"/>
   </w:num>
   <w:num w:numId="5" w16cid:durableId="716047706">
-    <w:abstractNumId w:val="16"/>
+    <w:abstractNumId w:val="18"/>
   </w:num>
   <w:num w:numId="6" w16cid:durableId="720325003">
     <w:abstractNumId w:val="6"/>
@@ -6017,19 +6301,19 @@
     <w:abstractNumId w:val="2"/>
   </w:num>
   <w:num w:numId="8" w16cid:durableId="120922881">
-    <w:abstractNumId w:val="11"/>
+    <w:abstractNumId w:val="12"/>
   </w:num>
   <w:num w:numId="9" w16cid:durableId="1235703492">
-    <w:abstractNumId w:val="18"/>
+    <w:abstractNumId w:val="20"/>
   </w:num>
   <w:num w:numId="10" w16cid:durableId="1392388983">
-    <w:abstractNumId w:val="9"/>
+    <w:abstractNumId w:val="10"/>
   </w:num>
   <w:num w:numId="11" w16cid:durableId="100883947">
-    <w:abstractNumId w:val="13"/>
+    <w:abstractNumId w:val="14"/>
   </w:num>
   <w:num w:numId="12" w16cid:durableId="1372923191">
-    <w:abstractNumId w:val="17"/>
+    <w:abstractNumId w:val="19"/>
   </w:num>
   <w:num w:numId="13" w16cid:durableId="105006249">
     <w:abstractNumId w:val="7"/>
@@ -6038,10 +6322,10 @@
     <w:abstractNumId w:val="3"/>
   </w:num>
   <w:num w:numId="15" w16cid:durableId="894705781">
-    <w:abstractNumId w:val="10"/>
+    <w:abstractNumId w:val="11"/>
   </w:num>
   <w:num w:numId="16" w16cid:durableId="1002855345">
-    <w:abstractNumId w:val="12"/>
+    <w:abstractNumId w:val="13"/>
   </w:num>
   <w:num w:numId="17" w16cid:durableId="1990472953">
     <w:abstractNumId w:val="8"/>
@@ -6050,7 +6334,13 @@
     <w:abstractNumId w:val="5"/>
   </w:num>
   <w:num w:numId="19" w16cid:durableId="1632518934">
+    <w:abstractNumId w:val="17"/>
+  </w:num>
+  <w:num w:numId="20" w16cid:durableId="1760062226">
     <w:abstractNumId w:val="15"/>
+  </w:num>
+  <w:num w:numId="21" w16cid:durableId="1476293983">
+    <w:abstractNumId w:val="9"/>
   </w:num>
 </w:numbering>
 </file>
@@ -7176,6 +7466,18 @@
       <w:shd w:val="clear" w:color="auto" w:fill="E1DFDD"/>
     </w:rPr>
   </w:style>
+  <w:style w:type="character" w:styleId="FollowedHyperlink">
+    <w:name w:val="FollowedHyperlink"/>
+    <w:basedOn w:val="DefaultParagraphFont"/>
+    <w:uiPriority w:val="99"/>
+    <w:semiHidden/>
+    <w:unhideWhenUsed/>
+    <w:rsid w:val="000C7B78"/>
+    <w:rPr>
+      <w:color w:val="96607D" w:themeColor="followedHyperlink"/>
+      <w:u w:val="single"/>
+    </w:rPr>
+  </w:style>
 </w:styles>
 </file>
 
@@ -7475,12 +7777,6 @@
 </file>
 
 <file path=customXml/item1.xml><?xml version="1.0" encoding="utf-8"?>
-<go:gDocsCustomXmlDataStorage xmlns:go="http://customooxmlschemas.google.com/" xmlns:r="http://schemas.openxmlformats.org/officeDocument/2006/relationships" uri="GoogleDocsCustomDataVersion2">
-  <go:docsCustomData xmlns:go="http://customooxmlschemas.google.com/" roundtripDataSignature="AMtx7miehlgh2pzFvkmpnhkVaeODs3Wnuw==">CgMxLjAyCGguZ2pkZ3hzMgloLjMwajB6bGwyCWguMWZvYjl0ZTIJaC4zem55c2g3MgloLjJldDkycDAyDmgua2ZranMzcndsMmMxOAByITF6bEVRVXYyWkdtTjZWemdfYk5uaGpmb0x1c2hhYUo3dw==</go:docsCustomData>
-</go:gDocsCustomXmlDataStorage>
-</file>
-
-<file path=customXml/item2.xml><?xml version="1.0" encoding="utf-8"?>
 <p:properties xmlns:p="http://schemas.microsoft.com/office/2006/metadata/properties" xmlns:xsi="http://www.w3.org/2001/XMLSchema-instance" xmlns:pc="http://schemas.microsoft.com/office/infopath/2007/PartnerControls">
   <documentManagement>
     <_activity xmlns="b16a9495-4dfd-42d3-807b-98cb11f03b43" xsi:nil="true"/>
@@ -7488,20 +7784,13 @@
 </p:properties>
 </file>
 
-<file path=customXml/item3.xml><?xml version="1.0" encoding="utf-8"?>
-<?mso-contentType ?>
-<FormTemplates xmlns="http://schemas.microsoft.com/sharepoint/v3/contenttype/forms">
-  <Display>DocumentLibraryForm</Display>
-  <Edit>DocumentLibraryForm</Edit>
-  <New>DocumentLibraryForm</New>
-</FormTemplates>
+<file path=customXml/item2.xml><?xml version="1.0" encoding="utf-8"?>
+<go:gDocsCustomXmlDataStorage xmlns:go="http://customooxmlschemas.google.com/" xmlns:r="http://schemas.openxmlformats.org/officeDocument/2006/relationships" uri="GoogleDocsCustomDataVersion2">
+  <go:docsCustomData xmlns:go="http://customooxmlschemas.google.com/" roundtripDataSignature="AMtx7miehlgh2pzFvkmpnhkVaeODs3Wnuw==">CgMxLjAyCGguZ2pkZ3hzMgloLjMwajB6bGwyCWguMWZvYjl0ZTIJaC4zem55c2g3MgloLjJldDkycDAyDmgua2ZranMzcndsMmMxOAByITF6bEVRVXYyWkdtTjZWemdfYk5uaGpmb0x1c2hhYUo3dw==</go:docsCustomData>
+</go:gDocsCustomXmlDataStorage>
 </file>
 
-<file path=customXml/item4.xml><?xml version="1.0" encoding="utf-8"?>
-<b:Sources xmlns:b="http://schemas.openxmlformats.org/officeDocument/2006/bibliography" xmlns="http://schemas.openxmlformats.org/officeDocument/2006/bibliography" SelectedStyle="\APASixthEditionOfficeOnline.xsl" StyleName="APA" Version="6"/>
-</file>
-
-<file path=customXml/item5.xml><?xml version="1.0" encoding="utf-8"?>
+<file path=customXml/item3.xml><?xml version="1.0" encoding="utf-8"?>
 <ct:contentTypeSchema xmlns:ct="http://schemas.microsoft.com/office/2006/metadata/contentType" xmlns:ma="http://schemas.microsoft.com/office/2006/metadata/properties/metaAttributes" ct:_="" ma:_="" ma:contentTypeName="Document" ma:contentTypeID="0x01010091CA7052A48FB44E8BAE44044031FC77" ma:contentTypeVersion="5" ma:contentTypeDescription="Create a new document." ma:contentTypeScope="" ma:versionID="72110da391d7bf7bbbd9879cda66318c">
   <xsd:schema xmlns:xsd="http://www.w3.org/2001/XMLSchema" xmlns:xs="http://www.w3.org/2001/XMLSchema" xmlns:p="http://schemas.microsoft.com/office/2006/metadata/properties" xmlns:ns3="b16a9495-4dfd-42d3-807b-98cb11f03b43" targetNamespace="http://schemas.microsoft.com/office/2006/metadata/properties" ma:root="true" ma:fieldsID="65d4c4ab10123b5e2192ffab3149626d" ns3:_="">
     <xsd:import namespace="b16a9495-4dfd-42d3-807b-98cb11f03b43"/>
@@ -7651,16 +7940,20 @@
 </ct:contentTypeSchema>
 </file>
 
-<file path=customXml/itemProps1.xml><?xml version="1.0" encoding="utf-8"?>
-<ds:datastoreItem xmlns:ds="http://schemas.openxmlformats.org/officeDocument/2006/customXml" ds:itemID="{11111111-1234-1234-1234-123412341234}">
-  <ds:schemaRefs>
-    <ds:schemaRef ds:uri="http://customooxmlschemas.google.com/"/>
-    <ds:schemaRef ds:uri="http://schemas.openxmlformats.org/officeDocument/2006/relationships"/>
-  </ds:schemaRefs>
-</ds:datastoreItem>
+<file path=customXml/item4.xml><?xml version="1.0" encoding="utf-8"?>
+<b:Sources xmlns:b="http://schemas.openxmlformats.org/officeDocument/2006/bibliography" xmlns="http://schemas.openxmlformats.org/officeDocument/2006/bibliography" SelectedStyle="\APASixthEditionOfficeOnline.xsl" StyleName="APA" Version="6"/>
 </file>
 
-<file path=customXml/itemProps2.xml><?xml version="1.0" encoding="utf-8"?>
+<file path=customXml/item5.xml><?xml version="1.0" encoding="utf-8"?>
+<?mso-contentType ?>
+<FormTemplates xmlns="http://schemas.microsoft.com/sharepoint/v3/contenttype/forms">
+  <Display>DocumentLibraryForm</Display>
+  <Edit>DocumentLibraryForm</Edit>
+  <New>DocumentLibraryForm</New>
+</FormTemplates>
+</file>
+
+<file path=customXml/itemProps1.xml><?xml version="1.0" encoding="utf-8"?>
 <ds:datastoreItem xmlns:ds="http://schemas.openxmlformats.org/officeDocument/2006/customXml" ds:itemID="{D51EB97A-8C7A-4EE1-A3AD-E57FDBFA6BEE}">
   <ds:schemaRefs>
     <ds:schemaRef ds:uri="http://schemas.microsoft.com/office/2006/metadata/properties"/>
@@ -7670,23 +7963,16 @@
 </ds:datastoreItem>
 </file>
 
-<file path=customXml/itemProps3.xml><?xml version="1.0" encoding="utf-8"?>
-<ds:datastoreItem xmlns:ds="http://schemas.openxmlformats.org/officeDocument/2006/customXml" ds:itemID="{AD64260C-1345-4C21-A804-B9FBE7B91489}">
+<file path=customXml/itemProps2.xml><?xml version="1.0" encoding="utf-8"?>
+<ds:datastoreItem xmlns:ds="http://schemas.openxmlformats.org/officeDocument/2006/customXml" ds:itemID="{11111111-1234-1234-1234-123412341234}">
   <ds:schemaRefs>
-    <ds:schemaRef ds:uri="http://schemas.microsoft.com/sharepoint/v3/contenttype/forms"/>
+    <ds:schemaRef ds:uri="http://customooxmlschemas.google.com/"/>
+    <ds:schemaRef ds:uri="http://schemas.openxmlformats.org/officeDocument/2006/relationships"/>
   </ds:schemaRefs>
 </ds:datastoreItem>
 </file>
 
-<file path=customXml/itemProps4.xml><?xml version="1.0" encoding="utf-8"?>
-<ds:datastoreItem xmlns:ds="http://schemas.openxmlformats.org/officeDocument/2006/customXml" ds:itemID="{A5C61161-19E4-4D42-A5DA-EC591AFE0A7D}">
-  <ds:schemaRefs>
-    <ds:schemaRef ds:uri="http://schemas.openxmlformats.org/officeDocument/2006/bibliography"/>
-  </ds:schemaRefs>
-</ds:datastoreItem>
-</file>
-
-<file path=customXml/itemProps5.xml><?xml version="1.0" encoding="utf-8"?>
+<file path=customXml/itemProps3.xml><?xml version="1.0" encoding="utf-8"?>
 <ds:datastoreItem xmlns:ds="http://schemas.openxmlformats.org/officeDocument/2006/customXml" ds:itemID="{1CD39011-2B34-4226-8638-59B13D86301D}">
   <ds:schemaRefs>
     <ds:schemaRef ds:uri="http://schemas.microsoft.com/office/2006/metadata/contentType"/>
@@ -7702,4 +7988,20 @@
     <ds:schemaRef ds:uri="http://schemas.microsoft.com/internal/obd"/>
   </ds:schemaRefs>
 </ds:datastoreItem>
+</file>
+
+<file path=customXml/itemProps4.xml><?xml version="1.0" encoding="utf-8"?>
+<ds:datastoreItem xmlns:ds="http://schemas.openxmlformats.org/officeDocument/2006/customXml" ds:itemID="{A5C61161-19E4-4D42-A5DA-EC591AFE0A7D}">
+  <ds:schemaRefs>
+    <ds:schemaRef ds:uri="http://schemas.openxmlformats.org/officeDocument/2006/bibliography"/>
+  </ds:schemaRefs>
+</ds:datastoreItem>
+</file>
+
+<file path=customXml/itemProps5.xml><?xml version="1.0" encoding="utf-8"?>
+<ds:datastoreItem xmlns:ds="http://schemas.openxmlformats.org/officeDocument/2006/customXml" ds:itemID="{AD64260C-1345-4C21-A804-B9FBE7B91489}">
+  <ds:schemaRefs>
+    <ds:schemaRef ds:uri="http://schemas.microsoft.com/sharepoint/v3/contenttype/forms"/>
+  </ds:schemaRefs>
+</ds:datastoreItem>
 </file>
</xml_diff>